<commit_message>
scripts e insercao de dados no BD
</commit_message>
<xml_diff>
--- a/documentacao/PROJETO EVASÃO ESCOLAR.docx
+++ b/documentacao/PROJETO EVASÃO ESCOLAR.docx
@@ -1,124 +1,175 @@
 
 <file path=word/document.xml><?xml version="1.0" encoding="utf-8"?>
-<w:document xmlns:mc="http://schemas.openxmlformats.org/markup-compatibility/2006" xmlns:o="urn:schemas-microsoft-com:office:office" xmlns:r="http://schemas.openxmlformats.org/officeDocument/2006/relationships" xmlns:m="http://schemas.openxmlformats.org/officeDocument/2006/math" xmlns:v="urn:schemas-microsoft-com:vml" xmlns:wp="http://schemas.openxmlformats.org/drawingml/2006/wordprocessingDrawing" xmlns:w10="urn:schemas-microsoft-com:office:word" xmlns:w="http://schemas.openxmlformats.org/wordprocessingml/2006/main" xmlns:wne="http://schemas.microsoft.com/office/word/2006/wordml" xmlns:sl="http://schemas.openxmlformats.org/schemaLibrary/2006/main" xmlns:a="http://schemas.openxmlformats.org/drawingml/2006/main" xmlns:pic="http://schemas.openxmlformats.org/drawingml/2006/picture" xmlns:c="http://schemas.openxmlformats.org/drawingml/2006/chart" xmlns:lc="http://schemas.openxmlformats.org/drawingml/2006/lockedCanvas" xmlns:dgm="http://schemas.openxmlformats.org/drawingml/2006/diagram" xmlns:wps="http://schemas.microsoft.com/office/word/2010/wordprocessingShape" xmlns:wpg="http://schemas.microsoft.com/office/word/2010/wordprocessingGroup" xmlns:w14="http://schemas.microsoft.com/office/word/2010/wordml" xmlns:w15="http://schemas.microsoft.com/office/word/2012/wordml" xmlns:w16="http://schemas.microsoft.com/office/word/2018/wordml" xmlns:w16cex="http://schemas.microsoft.com/office/word/2018/wordml/cex" xmlns:w16cid="http://schemas.microsoft.com/office/word/2016/wordml/cid" xmlns="http://schemas.microsoft.com/office/tasks/2019/documenttasks" xmlns:cr="http://schemas.microsoft.com/office/comments/2020/reactions">
+<w:document xmlns:wpc="http://schemas.microsoft.com/office/word/2010/wordprocessingCanvas" xmlns:cx="http://schemas.microsoft.com/office/drawing/2014/chartex" xmlns:cx1="http://schemas.microsoft.com/office/drawing/2015/9/8/chartex" xmlns:cx2="http://schemas.microsoft.com/office/drawing/2015/10/21/chartex" xmlns:cx3="http://schemas.microsoft.com/office/drawing/2016/5/9/chartex" xmlns:cx4="http://schemas.microsoft.com/office/drawing/2016/5/10/chartex" xmlns:cx5="http://schemas.microsoft.com/office/drawing/2016/5/11/chartex" xmlns:cx6="http://schemas.microsoft.com/office/drawing/2016/5/12/chartex" xmlns:cx7="http://schemas.microsoft.com/office/drawing/2016/5/13/chartex" xmlns:cx8="http://schemas.microsoft.com/office/drawing/2016/5/14/chartex" xmlns:mc="http://schemas.openxmlformats.org/markup-compatibility/2006" xmlns:aink="http://schemas.microsoft.com/office/drawing/2016/ink" xmlns:am3d="http://schemas.microsoft.com/office/drawing/2017/model3d" xmlns:o="urn:schemas-microsoft-com:office:office" xmlns:r="http://schemas.openxmlformats.org/officeDocument/2006/relationships" xmlns:m="http://schemas.openxmlformats.org/officeDocument/2006/math" xmlns:v="urn:schemas-microsoft-com:vml" xmlns:wp14="http://schemas.microsoft.com/office/word/2010/wordprocessingDrawing" xmlns:wp="http://schemas.openxmlformats.org/drawingml/2006/wordprocessingDrawing" xmlns:w10="urn:schemas-microsoft-com:office:word" xmlns:w="http://schemas.openxmlformats.org/wordprocessingml/2006/main" xmlns:w14="http://schemas.microsoft.com/office/word/2010/wordml" xmlns:w15="http://schemas.microsoft.com/office/word/2012/wordml" xmlns:w16cid="http://schemas.microsoft.com/office/word/2016/wordml/cid" xmlns:w16se="http://schemas.microsoft.com/office/word/2015/wordml/symex" xmlns:wpg="http://schemas.microsoft.com/office/word/2010/wordprocessingGroup" xmlns:wpi="http://schemas.microsoft.com/office/word/2010/wordprocessingInk" xmlns:wne="http://schemas.microsoft.com/office/word/2006/wordml" xmlns:wps="http://schemas.microsoft.com/office/word/2010/wordprocessingShape" mc:Ignorable="w14 w15 w16se w16cid wp14">
   <w:body>
     <w:p>
       <w:pPr>
-        <w:spacing w:after="240" w:before="240" w:lineRule="auto"/>
-        <w:rPr/>
-      </w:pPr>
-      <w:r>
-        <w:rPr>
-          <w:rtl w:val="0"/>
+        <w:spacing w:before="240" w:after="240"/>
+      </w:pPr>
+      <w:r>
+        <w:rPr>
+          <w:lang w:val="pt-BR"/>
         </w:rPr>
         <w:t xml:space="preserve">A pesquisa do IBGE sobre evasão escolar fica principalmente dentro da </w:t>
       </w:r>
       <w:r>
         <w:rPr>
-          <w:b w:val="1"/>
-          <w:bCs w:val="1"/>
-          <w:rtl w:val="0"/>
-        </w:rPr>
-        <w:t xml:space="preserve">PNAD Contínua – Educação</w:t>
-      </w:r>
-      <w:r>
-        <w:rPr>
-          <w:rtl w:val="0"/>
-        </w:rPr>
-        <w:t xml:space="preserve">.</w:t>
-        <w:br w:type="textWrapping"/>
-        <w:t xml:space="preserve">Os melhores links oficiais são estes:</w:t>
-      </w:r>
-    </w:p>
-    <w:p>
-      <w:pPr>
-        <w:rPr/>
-      </w:pPr>
-      <w:r>
-        <w:pict>
-          <v:rect style="width:0.0pt;height:1.5pt" o:hr="t" o:hrstd="t" o:hralign="center" fillcolor="#A0A0A0" stroked="f"/>
+          <w:b/>
+          <w:bCs/>
+          <w:lang w:val="pt-BR"/>
+        </w:rPr>
+        <w:t>PNAD Contínua – Educação</w:t>
+      </w:r>
+      <w:r>
+        <w:rPr>
+          <w:lang w:val="pt-BR"/>
+        </w:rPr>
+        <w:t>.</w:t>
+      </w:r>
+      <w:r>
+        <w:rPr>
+          <w:lang w:val="pt-BR"/>
+        </w:rPr>
+        <w:br/>
+      </w:r>
+      <w:proofErr w:type="spellStart"/>
+      <w:r>
+        <w:t>Os</w:t>
+      </w:r>
+      <w:proofErr w:type="spellEnd"/>
+      <w:r>
+        <w:t xml:space="preserve"> </w:t>
+      </w:r>
+      <w:proofErr w:type="spellStart"/>
+      <w:r>
+        <w:t>melhor</w:t>
+      </w:r>
+      <w:bookmarkStart w:id="0" w:name="_GoBack"/>
+      <w:bookmarkEnd w:id="0"/>
+      <w:r>
+        <w:t>es</w:t>
+      </w:r>
+      <w:proofErr w:type="spellEnd"/>
+      <w:r>
+        <w:t xml:space="preserve"> links </w:t>
+      </w:r>
+      <w:proofErr w:type="spellStart"/>
+      <w:r>
+        <w:t>oficiais</w:t>
+      </w:r>
+      <w:proofErr w:type="spellEnd"/>
+      <w:r>
+        <w:t xml:space="preserve"> </w:t>
+      </w:r>
+      <w:proofErr w:type="spellStart"/>
+      <w:r>
+        <w:t>são</w:t>
+      </w:r>
+      <w:proofErr w:type="spellEnd"/>
+      <w:r>
+        <w:t xml:space="preserve"> </w:t>
+      </w:r>
+      <w:proofErr w:type="spellStart"/>
+      <w:r>
+        <w:t>estes</w:t>
+      </w:r>
+      <w:proofErr w:type="spellEnd"/>
+      <w:r>
+        <w:t>:</w:t>
+      </w:r>
+    </w:p>
+    <w:p>
+      <w:r>
+        <w:pict w14:anchorId="6D42B17B">
+          <v:rect id="_x0000_i1025" style="width:0;height:1.5pt" o:hralign="center" o:hrstd="t" o:hr="t" fillcolor="#a0a0a0" stroked="f"/>
         </w:pict>
       </w:r>
-      <w:r>
-        <w:rPr>
-          <w:rtl w:val="0"/>
-        </w:rPr>
-      </w:r>
-    </w:p>
-    <w:p>
-      <w:pPr>
-        <w:pStyle w:val="Heading3"/>
+    </w:p>
+    <w:p>
+      <w:pPr>
+        <w:pStyle w:val="Ttulo3"/>
         <w:keepNext w:val="0"/>
         <w:keepLines w:val="0"/>
-        <w:spacing w:before="280" w:lineRule="auto"/>
-        <w:rPr>
-          <w:b w:val="1"/>
-          <w:bCs w:val="1"/>
+        <w:spacing w:before="280"/>
+        <w:rPr>
+          <w:b/>
+          <w:bCs/>
           <w:color w:val="000000"/>
           <w:sz w:val="26"/>
           <w:szCs w:val="26"/>
-        </w:rPr>
-      </w:pPr>
-      <w:bookmarkStart w:colFirst="0" w:colLast="0" w:name="_87o6qgbz9bwq" w:id="0"/>
-      <w:bookmarkEnd w:id="0"/>
-      <w:r>
-        <w:rPr>
-          <w:b w:val="1"/>
-          <w:bCs w:val="1"/>
+          <w:lang w:val="pt-BR"/>
+        </w:rPr>
+      </w:pPr>
+      <w:bookmarkStart w:id="1" w:name="_87o6qgbz9bwq" w:colFirst="0" w:colLast="0"/>
+      <w:bookmarkEnd w:id="1"/>
+      <w:r>
+        <w:rPr>
+          <w:b/>
+          <w:bCs/>
           <w:color w:val="000000"/>
           <w:sz w:val="26"/>
           <w:szCs w:val="26"/>
-          <w:rtl w:val="0"/>
-        </w:rPr>
-        <w:t xml:space="preserve">📊 PNAD Contínua – Educação (IBGE)</w:t>
-      </w:r>
-    </w:p>
-    <w:p>
-      <w:pPr>
-        <w:spacing w:after="240" w:before="240" w:lineRule="auto"/>
-        <w:rPr/>
-      </w:pPr>
-      <w:r>
-        <w:rPr>
-          <w:rtl w:val="0"/>
-        </w:rPr>
-        <w:t xml:space="preserve">Base principal usada para estudar evasão e abandono escolar no Brasil.</w:t>
-      </w:r>
-    </w:p>
-    <w:p>
-      <w:pPr>
-        <w:spacing w:after="240" w:before="240" w:lineRule="auto"/>
-        <w:rPr>
-          <w:color w:val="1155cc"/>
+        </w:rPr>
+        <w:t>📊</w:t>
+      </w:r>
+      <w:r>
+        <w:rPr>
+          <w:b/>
+          <w:bCs/>
+          <w:color w:val="000000"/>
+          <w:sz w:val="26"/>
+          <w:szCs w:val="26"/>
+          <w:lang w:val="pt-BR"/>
+        </w:rPr>
+        <w:t xml:space="preserve"> PNAD Contínua – Educação (IBGE)</w:t>
+      </w:r>
+    </w:p>
+    <w:p>
+      <w:pPr>
+        <w:spacing w:before="240" w:after="240"/>
+        <w:rPr>
+          <w:lang w:val="pt-BR"/>
+        </w:rPr>
+      </w:pPr>
+      <w:r>
+        <w:rPr>
+          <w:lang w:val="pt-BR"/>
+        </w:rPr>
+        <w:t>Base principal usada para estudar evasão e abandono escolar no Brasil.</w:t>
+      </w:r>
+    </w:p>
+    <w:p>
+      <w:pPr>
+        <w:spacing w:before="240" w:after="240"/>
+        <w:rPr>
+          <w:color w:val="1155CC"/>
           <w:u w:val="single"/>
-        </w:rPr>
-      </w:pPr>
-      <w:hyperlink r:id="rId6">
+          <w:lang w:val="pt-BR"/>
+        </w:rPr>
+      </w:pPr>
+      <w:hyperlink r:id="rId5">
         <w:r>
           <w:rPr>
-            <w:color w:val="1155cc"/>
+            <w:color w:val="1155CC"/>
             <w:u w:val="single"/>
-            <w:rtl w:val="0"/>
+            <w:lang w:val="pt-BR"/>
           </w:rPr>
-          <w:t xml:space="preserve">PNAD Contínua – Educação 2024 (IBGE)</w:t>
+          <w:t>PNAD Contínua – Educação 2024 (IBGE)</w:t>
         </w:r>
       </w:hyperlink>
-      <w:r>
-        <w:rPr>
-          <w:rtl w:val="0"/>
-        </w:rPr>
-      </w:r>
-    </w:p>
-    <w:p>
-      <w:pPr>
-        <w:spacing w:after="240" w:before="240" w:lineRule="auto"/>
-        <w:rPr/>
-      </w:pPr>
-      <w:r>
-        <w:rPr>
-          <w:rtl w:val="0"/>
-        </w:rPr>
-        <w:t xml:space="preserve">Tem dados sobre:</w:t>
+    </w:p>
+    <w:p>
+      <w:pPr>
+        <w:spacing w:before="240" w:after="240"/>
+        <w:rPr>
+          <w:lang w:val="pt-BR"/>
+        </w:rPr>
+      </w:pPr>
+      <w:r>
+        <w:rPr>
+          <w:lang w:val="pt-BR"/>
+        </w:rPr>
+        <w:t>Tem dados sobre:</w:t>
       </w:r>
     </w:p>
     <w:p>
@@ -127,14 +178,16 @@
           <w:ilvl w:val="0"/>
           <w:numId w:val="3"/>
         </w:numPr>
-        <w:spacing w:after="0" w:afterAutospacing="0" w:before="240" w:lineRule="auto"/>
-        <w:ind w:left="720" w:hanging="360"/>
-      </w:pPr>
-      <w:r>
-        <w:rPr>
-          <w:rtl w:val="0"/>
-        </w:rPr>
-        <w:t xml:space="preserve">jovens que abandonaram a escola;</w:t>
+        <w:spacing w:before="240"/>
+        <w:rPr>
+          <w:lang w:val="pt-BR"/>
+        </w:rPr>
+      </w:pPr>
+      <w:r>
+        <w:rPr>
+          <w:lang w:val="pt-BR"/>
+        </w:rPr>
+        <w:t>jovens que abandonaram a escola;</w:t>
       </w:r>
     </w:p>
     <w:p>
@@ -143,14 +196,22 @@
           <w:ilvl w:val="0"/>
           <w:numId w:val="3"/>
         </w:numPr>
-        <w:spacing w:after="0" w:afterAutospacing="0" w:before="0" w:beforeAutospacing="0" w:lineRule="auto"/>
-        <w:ind w:left="720" w:hanging="360"/>
-      </w:pPr>
-      <w:r>
-        <w:rPr>
-          <w:rtl w:val="0"/>
-        </w:rPr>
-        <w:t xml:space="preserve">motivo da evasão;</w:t>
+      </w:pPr>
+      <w:proofErr w:type="spellStart"/>
+      <w:r>
+        <w:t>motivo</w:t>
+      </w:r>
+      <w:proofErr w:type="spellEnd"/>
+      <w:r>
+        <w:t xml:space="preserve"> da </w:t>
+      </w:r>
+      <w:proofErr w:type="spellStart"/>
+      <w:r>
+        <w:t>evasão</w:t>
+      </w:r>
+      <w:proofErr w:type="spellEnd"/>
+      <w:r>
+        <w:t>.</w:t>
       </w:r>
     </w:p>
     <w:p>
@@ -159,14 +220,27 @@
           <w:ilvl w:val="0"/>
           <w:numId w:val="3"/>
         </w:numPr>
-        <w:spacing w:after="0" w:afterAutospacing="0" w:before="0" w:beforeAutospacing="0" w:lineRule="auto"/>
-        <w:ind w:left="720" w:hanging="360"/>
-      </w:pPr>
-      <w:r>
-        <w:rPr>
-          <w:rtl w:val="0"/>
-        </w:rPr>
-        <w:t xml:space="preserve">idade em que deixaram de estudar;</w:t>
+        <w:rPr>
+          <w:lang w:val="pt-BR"/>
+        </w:rPr>
+      </w:pPr>
+      <w:r>
+        <w:rPr>
+          <w:lang w:val="pt-BR"/>
+        </w:rPr>
+        <w:t>idade em</w:t>
+      </w:r>
+      <w:r>
+        <w:rPr>
+          <w:lang w:val="pt-BR"/>
+        </w:rPr>
+        <w:t xml:space="preserve"> que deixaram de estudar</w:t>
+      </w:r>
+      <w:r>
+        <w:rPr>
+          <w:lang w:val="pt-BR"/>
+        </w:rPr>
+        <w:t>.</w:t>
       </w:r>
     </w:p>
     <w:p>
@@ -175,129 +249,145 @@
           <w:ilvl w:val="0"/>
           <w:numId w:val="3"/>
         </w:numPr>
-        <w:spacing w:after="240" w:before="0" w:beforeAutospacing="0" w:lineRule="auto"/>
-        <w:ind w:left="720" w:hanging="360"/>
-      </w:pPr>
-      <w:r>
-        <w:rPr>
-          <w:rtl w:val="0"/>
-        </w:rPr>
-        <w:t xml:space="preserve">trabalho, gravidez, renda, raça etc.</w:t>
-      </w:r>
-    </w:p>
-    <w:p>
-      <w:pPr>
-        <w:rPr/>
-      </w:pPr>
-      <w:r>
-        <w:pict>
-          <v:rect style="width:0.0pt;height:1.5pt" o:hr="t" o:hrstd="t" o:hralign="center" fillcolor="#A0A0A0" stroked="f"/>
+        <w:spacing w:after="240"/>
+        <w:rPr>
+          <w:lang w:val="pt-BR"/>
+        </w:rPr>
+      </w:pPr>
+      <w:r>
+        <w:rPr>
+          <w:lang w:val="pt-BR"/>
+        </w:rPr>
+        <w:t>trabalho, gravidez, renda, raça etc.</w:t>
+      </w:r>
+    </w:p>
+    <w:p>
+      <w:r>
+        <w:pict w14:anchorId="6D42B17C">
+          <v:rect id="_x0000_i1026" style="width:0;height:1.5pt" o:hralign="center" o:hrstd="t" o:hr="t" fillcolor="#a0a0a0" stroked="f"/>
         </w:pict>
       </w:r>
-      <w:r>
-        <w:rPr>
-          <w:rtl w:val="0"/>
-        </w:rPr>
-      </w:r>
-    </w:p>
-    <w:p>
-      <w:pPr>
-        <w:pStyle w:val="Heading3"/>
+    </w:p>
+    <w:p>
+      <w:pPr>
+        <w:pStyle w:val="Ttulo3"/>
         <w:keepNext w:val="0"/>
         <w:keepLines w:val="0"/>
-        <w:spacing w:before="280" w:lineRule="auto"/>
-        <w:rPr>
-          <w:b w:val="1"/>
-          <w:bCs w:val="1"/>
+        <w:spacing w:before="280"/>
+        <w:rPr>
+          <w:b/>
+          <w:bCs/>
           <w:color w:val="000000"/>
           <w:sz w:val="26"/>
           <w:szCs w:val="26"/>
-        </w:rPr>
-      </w:pPr>
-      <w:bookmarkStart w:colFirst="0" w:colLast="0" w:name="_xm5qq22kyzh9" w:id="1"/>
-      <w:bookmarkEnd w:id="1"/>
-      <w:r>
-        <w:rPr>
-          <w:b w:val="1"/>
-          <w:bCs w:val="1"/>
+          <w:lang w:val="pt-BR"/>
+        </w:rPr>
+      </w:pPr>
+      <w:bookmarkStart w:id="2" w:name="_xm5qq22kyzh9" w:colFirst="0" w:colLast="0"/>
+      <w:bookmarkEnd w:id="2"/>
+      <w:r>
+        <w:rPr>
+          <w:b/>
+          <w:bCs/>
           <w:color w:val="000000"/>
           <w:sz w:val="26"/>
           <w:szCs w:val="26"/>
-          <w:rtl w:val="0"/>
-        </w:rPr>
-        <w:t xml:space="preserve">📈 Séries históricas de abandono escolar (IBGE)</w:t>
-      </w:r>
-    </w:p>
-    <w:p>
-      <w:pPr>
-        <w:spacing w:after="240" w:before="240" w:lineRule="auto"/>
-        <w:rPr/>
-      </w:pPr>
-      <w:r>
-        <w:rPr>
-          <w:rtl w:val="0"/>
-        </w:rPr>
-        <w:t xml:space="preserve">Tabela histórica oficial sobre abandono/evasão escolar.</w:t>
-      </w:r>
-    </w:p>
-    <w:p>
-      <w:pPr>
-        <w:spacing w:after="240" w:before="240" w:lineRule="auto"/>
-        <w:rPr>
-          <w:color w:val="1155cc"/>
+        </w:rPr>
+        <w:t>📈</w:t>
+      </w:r>
+      <w:r>
+        <w:rPr>
+          <w:b/>
+          <w:bCs/>
+          <w:color w:val="000000"/>
+          <w:sz w:val="26"/>
+          <w:szCs w:val="26"/>
+          <w:lang w:val="pt-BR"/>
+        </w:rPr>
+        <w:t xml:space="preserve"> Séries históricas de abandono escolar (IBGE)</w:t>
+      </w:r>
+    </w:p>
+    <w:p>
+      <w:pPr>
+        <w:spacing w:before="240" w:after="240"/>
+        <w:rPr>
+          <w:lang w:val="pt-BR"/>
+        </w:rPr>
+      </w:pPr>
+      <w:r>
+        <w:rPr>
+          <w:lang w:val="pt-BR"/>
+        </w:rPr>
+        <w:t>Tabela histórica oficial sobre abandono/evasão escolar.</w:t>
+      </w:r>
+    </w:p>
+    <w:p>
+      <w:pPr>
+        <w:spacing w:before="240" w:after="240"/>
+        <w:rPr>
+          <w:color w:val="1155CC"/>
           <w:u w:val="single"/>
+          <w:lang w:val="pt-BR"/>
+        </w:rPr>
+      </w:pPr>
+      <w:hyperlink r:id="rId6">
+        <w:r>
+          <w:rPr>
+            <w:color w:val="1155CC"/>
+            <w:u w:val="single"/>
+            <w:lang w:val="pt-BR"/>
+          </w:rPr>
+          <w:t>Séries Históricas – Abandono Escolar Ensino Médio (IBGE)</w:t>
+        </w:r>
+      </w:hyperlink>
+    </w:p>
+    <w:p>
+      <w:pPr>
+        <w:spacing w:before="240" w:after="240"/>
+        <w:rPr>
+          <w:color w:val="1155CC"/>
+          <w:u w:val="single"/>
+          <w:lang w:val="pt-BR"/>
         </w:rPr>
       </w:pPr>
       <w:hyperlink r:id="rId7">
         <w:r>
           <w:rPr>
-            <w:color w:val="1155cc"/>
+            <w:color w:val="1155CC"/>
             <w:u w:val="single"/>
-            <w:rtl w:val="0"/>
+            <w:lang w:val="pt-BR"/>
           </w:rPr>
-          <w:t xml:space="preserve">Séries Históricas – Abandono Escolar Ensino Médio (IBGE)</w:t>
+          <w:t>Séries Históricas – Abandono Escola</w:t>
+        </w:r>
+        <w:r>
+          <w:rPr>
+            <w:color w:val="1155CC"/>
+            <w:u w:val="single"/>
+            <w:lang w:val="pt-BR"/>
+          </w:rPr>
+          <w:t>r Ensino Fundamental (IBGE)</w:t>
         </w:r>
       </w:hyperlink>
-      <w:r>
-        <w:rPr>
-          <w:rtl w:val="0"/>
-        </w:rPr>
-      </w:r>
-    </w:p>
-    <w:p>
-      <w:pPr>
-        <w:spacing w:after="240" w:before="240" w:lineRule="auto"/>
-        <w:rPr>
-          <w:color w:val="1155cc"/>
-          <w:u w:val="single"/>
-        </w:rPr>
-      </w:pPr>
-      <w:hyperlink r:id="rId8">
-        <w:r>
-          <w:rPr>
-            <w:color w:val="1155cc"/>
-            <w:u w:val="single"/>
-            <w:rtl w:val="0"/>
-          </w:rPr>
-          <w:t xml:space="preserve">Séries Históricas – Abandono Escolar Ensino Fundamental (IBGE)</w:t>
-        </w:r>
-      </w:hyperlink>
-      <w:r>
-        <w:rPr>
-          <w:rtl w:val="0"/>
-        </w:rPr>
-      </w:r>
-    </w:p>
-    <w:p>
-      <w:pPr>
-        <w:spacing w:after="240" w:before="240" w:lineRule="auto"/>
-        <w:rPr/>
-      </w:pPr>
-      <w:r>
-        <w:rPr>
-          <w:rtl w:val="0"/>
-        </w:rPr>
-        <w:t xml:space="preserve">Muito bom para:</w:t>
+    </w:p>
+    <w:p>
+      <w:pPr>
+        <w:spacing w:before="240" w:after="240"/>
+      </w:pPr>
+      <w:proofErr w:type="spellStart"/>
+      <w:r>
+        <w:t>Muito</w:t>
+      </w:r>
+      <w:proofErr w:type="spellEnd"/>
+      <w:r>
+        <w:t xml:space="preserve"> </w:t>
+      </w:r>
+      <w:proofErr w:type="spellStart"/>
+      <w:r>
+        <w:t>bom</w:t>
+      </w:r>
+      <w:proofErr w:type="spellEnd"/>
+      <w:r>
+        <w:t xml:space="preserve"> para:</w:t>
       </w:r>
     </w:p>
     <w:p>
@@ -306,14 +396,15 @@
           <w:ilvl w:val="0"/>
           <w:numId w:val="4"/>
         </w:numPr>
-        <w:spacing w:after="0" w:afterAutospacing="0" w:before="240" w:lineRule="auto"/>
-        <w:ind w:left="720" w:hanging="360"/>
-      </w:pPr>
-      <w:r>
-        <w:rPr>
-          <w:rtl w:val="0"/>
-        </w:rPr>
-        <w:t xml:space="preserve">gráficos;</w:t>
+        <w:spacing w:before="240"/>
+      </w:pPr>
+      <w:proofErr w:type="spellStart"/>
+      <w:r>
+        <w:t>gráficos</w:t>
+      </w:r>
+      <w:proofErr w:type="spellEnd"/>
+      <w:r>
+        <w:t>;</w:t>
       </w:r>
     </w:p>
     <w:p>
@@ -322,14 +413,22 @@
           <w:ilvl w:val="0"/>
           <w:numId w:val="4"/>
         </w:numPr>
-        <w:spacing w:after="0" w:afterAutospacing="0" w:before="0" w:beforeAutospacing="0" w:lineRule="auto"/>
-        <w:ind w:left="720" w:hanging="360"/>
-      </w:pPr>
-      <w:r>
-        <w:rPr>
-          <w:rtl w:val="0"/>
-        </w:rPr>
-        <w:t xml:space="preserve">comparação por anos;</w:t>
+      </w:pPr>
+      <w:proofErr w:type="spellStart"/>
+      <w:r>
+        <w:t>comparação</w:t>
+      </w:r>
+      <w:proofErr w:type="spellEnd"/>
+      <w:r>
+        <w:t xml:space="preserve"> por </w:t>
+      </w:r>
+      <w:proofErr w:type="spellStart"/>
+      <w:r>
+        <w:t>anos</w:t>
+      </w:r>
+      <w:proofErr w:type="spellEnd"/>
+      <w:r>
+        <w:t>;</w:t>
       </w:r>
     </w:p>
     <w:p>
@@ -338,121 +437,146 @@
           <w:ilvl w:val="0"/>
           <w:numId w:val="4"/>
         </w:numPr>
-        <w:spacing w:after="240" w:before="0" w:beforeAutospacing="0" w:lineRule="auto"/>
-        <w:ind w:left="720" w:hanging="360"/>
-      </w:pPr>
-      <w:r>
-        <w:rPr>
-          <w:rtl w:val="0"/>
-        </w:rPr>
-        <w:t xml:space="preserve">análise temporal. (</w:t>
-      </w:r>
+        <w:spacing w:after="240"/>
+        <w:rPr>
+          <w:lang w:val="pt-BR"/>
+        </w:rPr>
+      </w:pPr>
+      <w:r>
+        <w:rPr>
+          <w:lang w:val="pt-BR"/>
+        </w:rPr>
+        <w:t>análise temporal. (</w:t>
+      </w:r>
+      <w:hyperlink r:id="rId8">
+        <w:r>
+          <w:rPr>
+            <w:color w:val="1155CC"/>
+            <w:u w:val="single"/>
+            <w:lang w:val="pt-BR"/>
+          </w:rPr>
+          <w:t>Séries Estatísticas IBGE</w:t>
+        </w:r>
+      </w:hyperlink>
+      <w:r>
+        <w:rPr>
+          <w:lang w:val="pt-BR"/>
+        </w:rPr>
+        <w:t>)</w:t>
+      </w:r>
+    </w:p>
+    <w:p>
+      <w:r>
+        <w:pict w14:anchorId="6D42B17D">
+          <v:rect id="_x0000_i1027" style="width:0;height:1.5pt" o:hralign="center" o:hrstd="t" o:hr="t" fillcolor="#a0a0a0" stroked="f"/>
+        </w:pict>
+      </w:r>
+    </w:p>
+    <w:p>
+      <w:pPr>
+        <w:pStyle w:val="Ttulo3"/>
+        <w:keepNext w:val="0"/>
+        <w:keepLines w:val="0"/>
+        <w:spacing w:before="280"/>
+        <w:rPr>
+          <w:b/>
+          <w:bCs/>
+          <w:color w:val="000000"/>
+          <w:sz w:val="26"/>
+          <w:szCs w:val="26"/>
+          <w:lang w:val="pt-BR"/>
+        </w:rPr>
+      </w:pPr>
+      <w:bookmarkStart w:id="3" w:name="_1rirsdpdwbc0" w:colFirst="0" w:colLast="0"/>
+      <w:bookmarkEnd w:id="3"/>
+      <w:r>
+        <w:rPr>
+          <w:b/>
+          <w:bCs/>
+          <w:color w:val="000000"/>
+          <w:sz w:val="26"/>
+          <w:szCs w:val="26"/>
+        </w:rPr>
+        <w:t>🗺</w:t>
+      </w:r>
+      <w:r>
+        <w:rPr>
+          <w:b/>
+          <w:bCs/>
+          <w:color w:val="000000"/>
+          <w:sz w:val="26"/>
+          <w:szCs w:val="26"/>
+        </w:rPr>
+        <w:t>️</w:t>
+      </w:r>
+      <w:r>
+        <w:rPr>
+          <w:b/>
+          <w:bCs/>
+          <w:color w:val="000000"/>
+          <w:sz w:val="26"/>
+          <w:szCs w:val="26"/>
+          <w:lang w:val="pt-BR"/>
+        </w:rPr>
+        <w:t xml:space="preserve"> Atlas </w:t>
+      </w:r>
+      <w:r>
+        <w:rPr>
+          <w:b/>
+          <w:bCs/>
+          <w:color w:val="000000"/>
+          <w:sz w:val="26"/>
+          <w:szCs w:val="26"/>
+          <w:lang w:val="pt-BR"/>
+        </w:rPr>
+        <w:t>Escolar do IBGE</w:t>
+      </w:r>
+    </w:p>
+    <w:p>
+      <w:pPr>
+        <w:spacing w:before="240" w:after="240"/>
+        <w:rPr>
+          <w:lang w:val="pt-BR"/>
+        </w:rPr>
+      </w:pPr>
+      <w:r>
+        <w:rPr>
+          <w:lang w:val="pt-BR"/>
+        </w:rPr>
+        <w:t>Mostra mapas e indicadores de abandono escolar no Brasil.</w:t>
+      </w:r>
+    </w:p>
+    <w:p>
+      <w:pPr>
+        <w:spacing w:before="240" w:after="240"/>
+        <w:rPr>
+          <w:color w:val="1155CC"/>
+          <w:u w:val="single"/>
+          <w:lang w:val="pt-BR"/>
+        </w:rPr>
+      </w:pPr>
       <w:hyperlink r:id="rId9">
         <w:r>
           <w:rPr>
-            <w:color w:val="1155cc"/>
+            <w:color w:val="1155CC"/>
             <w:u w:val="single"/>
-            <w:rtl w:val="0"/>
+            <w:lang w:val="pt-BR"/>
           </w:rPr>
-          <w:t xml:space="preserve">Séries Estatísticas IBGE</w:t>
+          <w:t>Atlas Escolar – Abandono Escolar (IBGE)</w:t>
         </w:r>
       </w:hyperlink>
-      <w:r>
-        <w:rPr>
-          <w:rtl w:val="0"/>
-        </w:rPr>
-        <w:t xml:space="preserve">)</w:t>
-      </w:r>
-    </w:p>
-    <w:p>
-      <w:pPr>
-        <w:rPr/>
-      </w:pPr>
-      <w:r>
-        <w:pict>
-          <v:rect style="width:0.0pt;height:1.5pt" o:hr="t" o:hrstd="t" o:hralign="center" fillcolor="#A0A0A0" stroked="f"/>
-        </w:pict>
-      </w:r>
-      <w:r>
-        <w:rPr>
-          <w:rtl w:val="0"/>
-        </w:rPr>
-      </w:r>
-    </w:p>
-    <w:p>
-      <w:pPr>
-        <w:pStyle w:val="Heading3"/>
-        <w:keepNext w:val="0"/>
-        <w:keepLines w:val="0"/>
-        <w:spacing w:before="280" w:lineRule="auto"/>
-        <w:rPr>
-          <w:b w:val="1"/>
-          <w:bCs w:val="1"/>
-          <w:color w:val="000000"/>
-          <w:sz w:val="26"/>
-          <w:szCs w:val="26"/>
-        </w:rPr>
-      </w:pPr>
-      <w:bookmarkStart w:colFirst="0" w:colLast="0" w:name="_1rirsdpdwbc0" w:id="2"/>
-      <w:bookmarkEnd w:id="2"/>
-      <w:r>
-        <w:rPr>
-          <w:b w:val="1"/>
-          <w:bCs w:val="1"/>
-          <w:color w:val="000000"/>
-          <w:sz w:val="26"/>
-          <w:szCs w:val="26"/>
-          <w:rtl w:val="0"/>
-        </w:rPr>
-        <w:t xml:space="preserve">🗺️ Atlas Escolar do IBGE</w:t>
-      </w:r>
-    </w:p>
-    <w:p>
-      <w:pPr>
-        <w:spacing w:after="240" w:before="240" w:lineRule="auto"/>
-        <w:rPr/>
-      </w:pPr>
-      <w:r>
-        <w:rPr>
-          <w:rtl w:val="0"/>
-        </w:rPr>
-        <w:t xml:space="preserve">Mostra mapas e indicadores de abandono escolar no Brasil.</w:t>
-      </w:r>
-    </w:p>
-    <w:p>
-      <w:pPr>
-        <w:spacing w:after="240" w:before="240" w:lineRule="auto"/>
-        <w:rPr>
-          <w:color w:val="1155cc"/>
-          <w:u w:val="single"/>
-        </w:rPr>
-      </w:pPr>
-      <w:hyperlink r:id="rId10">
-        <w:r>
-          <w:rPr>
-            <w:color w:val="1155cc"/>
-            <w:u w:val="single"/>
-            <w:rtl w:val="0"/>
-          </w:rPr>
-          <w:t xml:space="preserve">Atlas Escolar – Abandono Escolar (IBGE)</w:t>
-        </w:r>
-      </w:hyperlink>
-      <w:r>
-        <w:rPr>
-          <w:rtl w:val="0"/>
-        </w:rPr>
-      </w:r>
-    </w:p>
-    <w:p>
-      <w:pPr>
-        <w:spacing w:after="240" w:before="240" w:lineRule="auto"/>
-        <w:rPr/>
-      </w:pPr>
-      <w:r>
-        <w:rPr>
-          <w:rtl w:val="0"/>
-        </w:rPr>
-        <w:t xml:space="preserve">Tem:</w:t>
+    </w:p>
+    <w:p>
+      <w:pPr>
+        <w:spacing w:before="240" w:after="240"/>
+      </w:pPr>
+      <w:proofErr w:type="spellStart"/>
+      <w:r>
+        <w:t>Tem</w:t>
+      </w:r>
+      <w:proofErr w:type="spellEnd"/>
+      <w:r>
+        <w:t>:</w:t>
       </w:r>
     </w:p>
     <w:p>
@@ -461,14 +585,24 @@
           <w:ilvl w:val="0"/>
           <w:numId w:val="2"/>
         </w:numPr>
-        <w:spacing w:after="0" w:afterAutospacing="0" w:before="240" w:lineRule="auto"/>
-        <w:ind w:left="720" w:hanging="360"/>
-      </w:pPr>
-      <w:r>
-        <w:rPr>
-          <w:rtl w:val="0"/>
-        </w:rPr>
-        <w:t xml:space="preserve">mapa por estado;</w:t>
+        <w:spacing w:before="240"/>
+      </w:pPr>
+      <w:proofErr w:type="spellStart"/>
+      <w:r>
+        <w:lastRenderedPageBreak/>
+        <w:t>mapa</w:t>
+      </w:r>
+      <w:proofErr w:type="spellEnd"/>
+      <w:r>
+        <w:t xml:space="preserve"> por </w:t>
+      </w:r>
+      <w:proofErr w:type="spellStart"/>
+      <w:r>
+        <w:t>estado</w:t>
+      </w:r>
+      <w:proofErr w:type="spellEnd"/>
+      <w:r>
+        <w:t>;</w:t>
       </w:r>
     </w:p>
     <w:p>
@@ -477,14 +611,22 @@
           <w:ilvl w:val="0"/>
           <w:numId w:val="2"/>
         </w:numPr>
-        <w:spacing w:after="0" w:afterAutospacing="0" w:before="0" w:beforeAutospacing="0" w:lineRule="auto"/>
-        <w:ind w:left="720" w:hanging="360"/>
-      </w:pPr>
-      <w:r>
-        <w:rPr>
-          <w:rtl w:val="0"/>
-        </w:rPr>
-        <w:t xml:space="preserve">abandono no ensino fundamental;</w:t>
+      </w:pPr>
+      <w:proofErr w:type="spellStart"/>
+      <w:r>
+        <w:t>abandono</w:t>
+      </w:r>
+      <w:proofErr w:type="spellEnd"/>
+      <w:r>
+        <w:t xml:space="preserve"> no </w:t>
+      </w:r>
+      <w:proofErr w:type="spellStart"/>
+      <w:r>
+        <w:t>ensino</w:t>
+      </w:r>
+      <w:proofErr w:type="spellEnd"/>
+      <w:r>
+        <w:t xml:space="preserve"> fundamental;</w:t>
       </w:r>
     </w:p>
     <w:p>
@@ -493,121 +635,132 @@
           <w:ilvl w:val="0"/>
           <w:numId w:val="2"/>
         </w:numPr>
-        <w:spacing w:after="240" w:before="0" w:beforeAutospacing="0" w:lineRule="auto"/>
-        <w:ind w:left="720" w:hanging="360"/>
-      </w:pPr>
-      <w:r>
-        <w:rPr>
-          <w:rtl w:val="0"/>
-        </w:rPr>
-        <w:t xml:space="preserve">abandono no ensino médio. (</w:t>
-      </w:r>
+        <w:spacing w:after="240"/>
+        <w:rPr>
+          <w:lang w:val="pt-BR"/>
+        </w:rPr>
+      </w:pPr>
+      <w:r>
+        <w:rPr>
+          <w:lang w:val="pt-BR"/>
+        </w:rPr>
+        <w:t>abandono no ensino médio. (</w:t>
+      </w:r>
+      <w:hyperlink r:id="rId10">
+        <w:r>
+          <w:rPr>
+            <w:color w:val="1155CC"/>
+            <w:u w:val="single"/>
+            <w:lang w:val="pt-BR"/>
+          </w:rPr>
+          <w:t>Atlas Geográfico Escolar - IBGE</w:t>
+        </w:r>
+      </w:hyperlink>
+      <w:r>
+        <w:rPr>
+          <w:lang w:val="pt-BR"/>
+        </w:rPr>
+        <w:t>)</w:t>
+      </w:r>
+    </w:p>
+    <w:p>
+      <w:r>
+        <w:pict w14:anchorId="6D42B17E">
+          <v:rect id="_x0000_i1028" style="width:0;height:1.5pt" o:hralign="center" o:hrstd="t" o:hr="t" fillcolor="#a0a0a0" stroked="f"/>
+        </w:pict>
+      </w:r>
+    </w:p>
+    <w:p>
+      <w:pPr>
+        <w:pStyle w:val="Ttulo3"/>
+        <w:keepNext w:val="0"/>
+        <w:keepLines w:val="0"/>
+        <w:spacing w:before="280"/>
+        <w:rPr>
+          <w:b/>
+          <w:bCs/>
+          <w:color w:val="000000"/>
+          <w:sz w:val="26"/>
+          <w:szCs w:val="26"/>
+          <w:lang w:val="pt-BR"/>
+        </w:rPr>
+      </w:pPr>
+      <w:bookmarkStart w:id="4" w:name="_gxw6kwlh0v78" w:colFirst="0" w:colLast="0"/>
+      <w:bookmarkEnd w:id="4"/>
+      <w:r>
+        <w:rPr>
+          <w:b/>
+          <w:bCs/>
+          <w:color w:val="000000"/>
+          <w:sz w:val="26"/>
+          <w:szCs w:val="26"/>
+        </w:rPr>
+        <w:t>📘</w:t>
+      </w:r>
+      <w:r>
+        <w:rPr>
+          <w:b/>
+          <w:bCs/>
+          <w:color w:val="000000"/>
+          <w:sz w:val="26"/>
+          <w:szCs w:val="26"/>
+          <w:lang w:val="pt-BR"/>
+        </w:rPr>
+        <w:t xml:space="preserve"> Anuário Estatístico da Educação (IBGE)</w:t>
+      </w:r>
+    </w:p>
+    <w:p>
+      <w:pPr>
+        <w:spacing w:before="240" w:after="240"/>
+        <w:rPr>
+          <w:lang w:val="pt-BR"/>
+        </w:rPr>
+      </w:pPr>
+      <w:r>
+        <w:rPr>
+          <w:lang w:val="pt-BR"/>
+        </w:rPr>
+        <w:t>Resumo oficial de indicadores educacionais.</w:t>
+      </w:r>
+    </w:p>
+    <w:p>
+      <w:pPr>
+        <w:spacing w:before="240" w:after="240"/>
+        <w:rPr>
+          <w:color w:val="1155CC"/>
+          <w:u w:val="single"/>
+          <w:lang w:val="pt-BR"/>
+        </w:rPr>
+      </w:pPr>
       <w:hyperlink r:id="rId11">
         <w:r>
           <w:rPr>
-            <w:color w:val="1155cc"/>
+            <w:color w:val="1155CC"/>
             <w:u w:val="single"/>
-            <w:rtl w:val="0"/>
+            <w:lang w:val="pt-BR"/>
           </w:rPr>
-          <w:t xml:space="preserve">Atlas Geográfico Escolar - IBGE</w:t>
+          <w:t>Anuário Estatístico – Educação (IBGE)</w:t>
         </w:r>
       </w:hyperlink>
-      <w:r>
-        <w:rPr>
-          <w:rtl w:val="0"/>
-        </w:rPr>
-        <w:t xml:space="preserve">)</w:t>
-      </w:r>
-    </w:p>
-    <w:p>
-      <w:pPr>
-        <w:rPr/>
-      </w:pPr>
-      <w:r>
-        <w:pict>
-          <v:rect style="width:0.0pt;height:1.5pt" o:hr="t" o:hrstd="t" o:hralign="center" fillcolor="#A0A0A0" stroked="f"/>
-        </w:pict>
-      </w:r>
-      <w:r>
-        <w:rPr>
-          <w:rtl w:val="0"/>
-        </w:rPr>
-      </w:r>
-    </w:p>
-    <w:p>
-      <w:pPr>
-        <w:pStyle w:val="Heading3"/>
-        <w:keepNext w:val="0"/>
-        <w:keepLines w:val="0"/>
-        <w:spacing w:before="280" w:lineRule="auto"/>
-        <w:rPr>
-          <w:b w:val="1"/>
-          <w:bCs w:val="1"/>
-          <w:color w:val="000000"/>
-          <w:sz w:val="26"/>
-          <w:szCs w:val="26"/>
-        </w:rPr>
-      </w:pPr>
-      <w:bookmarkStart w:colFirst="0" w:colLast="0" w:name="_gxw6kwlh0v78" w:id="3"/>
-      <w:bookmarkEnd w:id="3"/>
-      <w:r>
-        <w:rPr>
-          <w:b w:val="1"/>
-          <w:bCs w:val="1"/>
-          <w:color w:val="000000"/>
-          <w:sz w:val="26"/>
-          <w:szCs w:val="26"/>
-          <w:rtl w:val="0"/>
-        </w:rPr>
-        <w:t xml:space="preserve">📘 Anuário Estatístico da Educação (IBGE)</w:t>
-      </w:r>
-    </w:p>
-    <w:p>
-      <w:pPr>
-        <w:spacing w:after="240" w:before="240" w:lineRule="auto"/>
-        <w:rPr/>
-      </w:pPr>
-      <w:r>
-        <w:rPr>
-          <w:rtl w:val="0"/>
-        </w:rPr>
-        <w:t xml:space="preserve">Resumo oficial de indicadores educacionais.</w:t>
-      </w:r>
-    </w:p>
-    <w:p>
-      <w:pPr>
-        <w:spacing w:after="240" w:before="240" w:lineRule="auto"/>
-        <w:rPr>
-          <w:color w:val="1155cc"/>
-          <w:u w:val="single"/>
-        </w:rPr>
-      </w:pPr>
-      <w:hyperlink r:id="rId12">
-        <w:r>
-          <w:rPr>
-            <w:color w:val="1155cc"/>
-            <w:u w:val="single"/>
-            <w:rtl w:val="0"/>
-          </w:rPr>
-          <w:t xml:space="preserve">Anuário Estatístico – Educação (IBGE)</w:t>
-        </w:r>
-      </w:hyperlink>
-      <w:r>
-        <w:rPr>
-          <w:rtl w:val="0"/>
-        </w:rPr>
-      </w:r>
-    </w:p>
-    <w:p>
-      <w:pPr>
-        <w:spacing w:after="240" w:before="240" w:lineRule="auto"/>
-        <w:rPr/>
-      </w:pPr>
-      <w:r>
-        <w:rPr>
-          <w:rtl w:val="0"/>
-        </w:rPr>
-        <w:t xml:space="preserve">O próprio IBGE cita indicadores de:</w:t>
+    </w:p>
+    <w:p>
+      <w:pPr>
+        <w:spacing w:before="240" w:after="240"/>
+        <w:rPr>
+          <w:lang w:val="pt-BR"/>
+        </w:rPr>
+      </w:pPr>
+      <w:r>
+        <w:rPr>
+          <w:lang w:val="pt-BR"/>
+        </w:rPr>
+        <w:t>O próprio IBGE</w:t>
+      </w:r>
+      <w:r>
+        <w:rPr>
+          <w:lang w:val="pt-BR"/>
+        </w:rPr>
+        <w:t xml:space="preserve"> cita indicadores de:</w:t>
       </w:r>
     </w:p>
     <w:p>
@@ -616,14 +769,15 @@
           <w:ilvl w:val="0"/>
           <w:numId w:val="1"/>
         </w:numPr>
-        <w:spacing w:after="0" w:afterAutospacing="0" w:before="240" w:lineRule="auto"/>
-        <w:ind w:left="720" w:hanging="360"/>
-      </w:pPr>
-      <w:r>
-        <w:rPr>
-          <w:rtl w:val="0"/>
-        </w:rPr>
-        <w:t xml:space="preserve">evasão;</w:t>
+        <w:spacing w:before="240"/>
+      </w:pPr>
+      <w:proofErr w:type="spellStart"/>
+      <w:r>
+        <w:t>evasão</w:t>
+      </w:r>
+      <w:proofErr w:type="spellEnd"/>
+      <w:r>
+        <w:t>;</w:t>
       </w:r>
     </w:p>
     <w:p>
@@ -632,14 +786,14 @@
           <w:ilvl w:val="0"/>
           <w:numId w:val="1"/>
         </w:numPr>
-        <w:spacing w:after="0" w:afterAutospacing="0" w:before="0" w:beforeAutospacing="0" w:lineRule="auto"/>
-        <w:ind w:left="720" w:hanging="360"/>
-      </w:pPr>
-      <w:r>
-        <w:rPr>
-          <w:rtl w:val="0"/>
-        </w:rPr>
-        <w:t xml:space="preserve">repetência;</w:t>
+      </w:pPr>
+      <w:proofErr w:type="spellStart"/>
+      <w:r>
+        <w:t>repetência</w:t>
+      </w:r>
+      <w:proofErr w:type="spellEnd"/>
+      <w:r>
+        <w:t>;</w:t>
       </w:r>
     </w:p>
     <w:p>
@@ -648,65 +802,73 @@
           <w:ilvl w:val="0"/>
           <w:numId w:val="1"/>
         </w:numPr>
-        <w:spacing w:after="240" w:before="0" w:beforeAutospacing="0" w:lineRule="auto"/>
-        <w:ind w:left="720" w:hanging="360"/>
-      </w:pPr>
-      <w:r>
-        <w:rPr>
-          <w:rtl w:val="0"/>
-        </w:rPr>
-        <w:t xml:space="preserve">fluxo escolar. (</w:t>
-      </w:r>
+        <w:spacing w:after="240"/>
+        <w:rPr>
+          <w:lang w:val="pt-BR"/>
+        </w:rPr>
+      </w:pPr>
+      <w:r>
+        <w:rPr>
+          <w:lang w:val="pt-BR"/>
+        </w:rPr>
+        <w:t>fluxo escolar. (</w:t>
+      </w:r>
+      <w:hyperlink r:id="rId12">
+        <w:r>
+          <w:rPr>
+            <w:color w:val="1155CC"/>
+            <w:u w:val="single"/>
+            <w:lang w:val="pt-BR"/>
+          </w:rPr>
+          <w:t>anuario.ibge.gov.br</w:t>
+        </w:r>
+      </w:hyperlink>
+      <w:r>
+        <w:rPr>
+          <w:lang w:val="pt-BR"/>
+        </w:rPr>
+        <w:t>)</w:t>
+      </w:r>
+    </w:p>
+    <w:p>
+      <w:pPr>
+        <w:rPr>
+          <w:lang w:val="pt-BR"/>
+        </w:rPr>
+      </w:pPr>
       <w:hyperlink r:id="rId13">
         <w:r>
           <w:rPr>
-            <w:color w:val="1155cc"/>
+            <w:color w:val="1155CC"/>
             <w:u w:val="single"/>
-            <w:rtl w:val="0"/>
+            <w:lang w:val="pt-BR"/>
           </w:rPr>
-          <w:t xml:space="preserve">anuario.ibge.gov.br</w:t>
+          <w:t>API de dados agregados do IBGE</w:t>
         </w:r>
       </w:hyperlink>
       <w:r>
         <w:rPr>
-          <w:rtl w:val="0"/>
-        </w:rPr>
-        <w:t xml:space="preserve">)</w:t>
-      </w:r>
-    </w:p>
-    <w:p>
-      <w:pPr>
-        <w:rPr/>
-      </w:pPr>
-      <w:hyperlink r:id="rId14">
-        <w:r>
-          <w:rPr>
-            <w:color w:val="1155cc"/>
-            <w:u w:val="single"/>
-            <w:rtl w:val="0"/>
-          </w:rPr>
-          <w:t xml:space="preserve">API de dados agregados do IBGE</w:t>
-        </w:r>
-      </w:hyperlink>
-      <w:r>
-        <w:rPr>
-          <w:rtl w:val="0"/>
+          <w:lang w:val="pt-BR"/>
         </w:rPr>
         <w:t xml:space="preserve"> </w:t>
       </w:r>
     </w:p>
     <w:sectPr>
-      <w:pgSz w:h="15840" w:w="12240" w:orient="portrait"/>
-      <w:pgMar w:bottom="1440" w:top="1440" w:left="1440" w:right="1440" w:header="720" w:footer="720"/>
+      <w:pgSz w:w="12240" w:h="15840"/>
+      <w:pgMar w:top="1440" w:right="1440" w:bottom="1440" w:left="1440" w:header="720" w:footer="720" w:gutter="0"/>
       <w:pgNumType w:start="1"/>
+      <w:cols w:space="720"/>
     </w:sectPr>
   </w:body>
 </w:document>
 </file>
 
 <file path=word/numbering.xml><?xml version="1.0" encoding="utf-8"?>
-<w:numbering xmlns:mc="http://schemas.openxmlformats.org/markup-compatibility/2006" xmlns:o="urn:schemas-microsoft-com:office:office" xmlns:r="http://schemas.openxmlformats.org/officeDocument/2006/relationships" xmlns:m="http://schemas.openxmlformats.org/officeDocument/2006/math" xmlns:v="urn:schemas-microsoft-com:vml" xmlns:wp="http://schemas.openxmlformats.org/drawingml/2006/wordprocessingDrawing" xmlns:w10="urn:schemas-microsoft-com:office:word" xmlns:w="http://schemas.openxmlformats.org/wordprocessingml/2006/main" xmlns:wne="http://schemas.microsoft.com/office/word/2006/wordml" xmlns:sl="http://schemas.openxmlformats.org/schemaLibrary/2006/main" xmlns:a="http://schemas.openxmlformats.org/drawingml/2006/main" xmlns:pic="http://schemas.openxmlformats.org/drawingml/2006/picture" xmlns:c="http://schemas.openxmlformats.org/drawingml/2006/chart" xmlns:lc="http://schemas.openxmlformats.org/drawingml/2006/lockedCanvas" xmlns:dgm="http://schemas.openxmlformats.org/drawingml/2006/diagram" xmlns:wps="http://schemas.microsoft.com/office/word/2010/wordprocessingShape" xmlns:wpg="http://schemas.microsoft.com/office/word/2010/wordprocessingGroup" xmlns:w14="http://schemas.microsoft.com/office/word/2010/wordml" xmlns:w15="http://schemas.microsoft.com/office/word/2012/wordml" xmlns:w16="http://schemas.microsoft.com/office/word/2018/wordml" xmlns:w16cex="http://schemas.microsoft.com/office/word/2018/wordml/cex" xmlns:w16cid="http://schemas.microsoft.com/office/word/2016/wordml/cid" xmlns="http://schemas.microsoft.com/office/tasks/2019/documenttasks" xmlns:cr="http://schemas.microsoft.com/office/comments/2020/reactions">
-  <w:abstractNum w:abstractNumId="1">
+<w:numbering xmlns:wpc="http://schemas.microsoft.com/office/word/2010/wordprocessingCanvas" xmlns:cx="http://schemas.microsoft.com/office/drawing/2014/chartex" xmlns:cx1="http://schemas.microsoft.com/office/drawing/2015/9/8/chartex" xmlns:cx2="http://schemas.microsoft.com/office/drawing/2015/10/21/chartex" xmlns:cx3="http://schemas.microsoft.com/office/drawing/2016/5/9/chartex" xmlns:cx4="http://schemas.microsoft.com/office/drawing/2016/5/10/chartex" xmlns:cx5="http://schemas.microsoft.com/office/drawing/2016/5/11/chartex" xmlns:cx6="http://schemas.microsoft.com/office/drawing/2016/5/12/chartex" xmlns:cx7="http://schemas.microsoft.com/office/drawing/2016/5/13/chartex" xmlns:cx8="http://schemas.microsoft.com/office/drawing/2016/5/14/chartex" xmlns:mc="http://schemas.openxmlformats.org/markup-compatibility/2006" xmlns:aink="http://schemas.microsoft.com/office/drawing/2016/ink" xmlns:am3d="http://schemas.microsoft.com/office/drawing/2017/model3d" xmlns:o="urn:schemas-microsoft-com:office:office" xmlns:r="http://schemas.openxmlformats.org/officeDocument/2006/relationships" xmlns:m="http://schemas.openxmlformats.org/officeDocument/2006/math" xmlns:v="urn:schemas-microsoft-com:vml" xmlns:wp14="http://schemas.microsoft.com/office/word/2010/wordprocessingDrawing" xmlns:wp="http://schemas.openxmlformats.org/drawingml/2006/wordprocessingDrawing" xmlns:w10="urn:schemas-microsoft-com:office:word" xmlns:w="http://schemas.openxmlformats.org/wordprocessingml/2006/main" xmlns:w14="http://schemas.microsoft.com/office/word/2010/wordml" xmlns:w15="http://schemas.microsoft.com/office/word/2012/wordml" xmlns:w16cid="http://schemas.microsoft.com/office/word/2016/wordml/cid" xmlns:w16se="http://schemas.microsoft.com/office/word/2015/wordml/symex" xmlns:wpg="http://schemas.microsoft.com/office/word/2010/wordprocessingGroup" xmlns:wpi="http://schemas.microsoft.com/office/word/2010/wordprocessingInk" xmlns:wne="http://schemas.microsoft.com/office/word/2006/wordml" xmlns:wps="http://schemas.microsoft.com/office/word/2010/wordprocessingShape" mc:Ignorable="w14 w15 w16se w16cid wp14">
+  <w:abstractNum w:abstractNumId="0" w15:restartNumberingAfterBreak="0">
+    <w:nsid w:val="1A2E16CE"/>
+    <w:multiLevelType w:val="multilevel"/>
+    <w:tmpl w:val="0B16CE8E"/>
     <w:lvl w:ilvl="0">
       <w:start w:val="1"/>
       <w:numFmt w:val="bullet"/>
@@ -816,7 +978,10 @@
       </w:rPr>
     </w:lvl>
   </w:abstractNum>
-  <w:abstractNum w:abstractNumId="2">
+  <w:abstractNum w:abstractNumId="1" w15:restartNumberingAfterBreak="0">
+    <w:nsid w:val="1D573FB1"/>
+    <w:multiLevelType w:val="multilevel"/>
+    <w:tmpl w:val="74EAA546"/>
     <w:lvl w:ilvl="0">
       <w:start w:val="1"/>
       <w:numFmt w:val="bullet"/>
@@ -926,7 +1091,10 @@
       </w:rPr>
     </w:lvl>
   </w:abstractNum>
-  <w:abstractNum w:abstractNumId="3">
+  <w:abstractNum w:abstractNumId="2" w15:restartNumberingAfterBreak="0">
+    <w:nsid w:val="32996245"/>
+    <w:multiLevelType w:val="multilevel"/>
+    <w:tmpl w:val="9E769DDA"/>
     <w:lvl w:ilvl="0">
       <w:start w:val="1"/>
       <w:numFmt w:val="bullet"/>
@@ -1036,7 +1204,10 @@
       </w:rPr>
     </w:lvl>
   </w:abstractNum>
-  <w:abstractNum w:abstractNumId="4">
+  <w:abstractNum w:abstractNumId="3" w15:restartNumberingAfterBreak="0">
+    <w:nsid w:val="6BE50B7A"/>
+    <w:multiLevelType w:val="multilevel"/>
+    <w:tmpl w:val="DF045932"/>
     <w:lvl w:ilvl="0">
       <w:start w:val="1"/>
       <w:numFmt w:val="bullet"/>
@@ -1147,29 +1318,29 @@
     </w:lvl>
   </w:abstractNum>
   <w:num w:numId="1">
-    <w:abstractNumId w:val="1"/>
+    <w:abstractNumId w:val="2"/>
   </w:num>
   <w:num w:numId="2">
-    <w:abstractNumId w:val="2"/>
+    <w:abstractNumId w:val="1"/>
   </w:num>
   <w:num w:numId="3">
     <w:abstractNumId w:val="3"/>
   </w:num>
   <w:num w:numId="4">
-    <w:abstractNumId w:val="4"/>
+    <w:abstractNumId w:val="0"/>
   </w:num>
 </w:numbering>
 </file>
 
 <file path=word/styles.xml><?xml version="1.0" encoding="utf-8"?>
-<w:styles xmlns:mc="http://schemas.openxmlformats.org/markup-compatibility/2006" xmlns:o="urn:schemas-microsoft-com:office:office" xmlns:r="http://schemas.openxmlformats.org/officeDocument/2006/relationships" xmlns:m="http://schemas.openxmlformats.org/officeDocument/2006/math" xmlns:v="urn:schemas-microsoft-com:vml" xmlns:wp="http://schemas.openxmlformats.org/drawingml/2006/wordprocessingDrawing" xmlns:w10="urn:schemas-microsoft-com:office:word" xmlns:w="http://schemas.openxmlformats.org/wordprocessingml/2006/main" xmlns:wne="http://schemas.microsoft.com/office/word/2006/wordml" xmlns:sl="http://schemas.openxmlformats.org/schemaLibrary/2006/main" xmlns:a="http://schemas.openxmlformats.org/drawingml/2006/main" xmlns:pic="http://schemas.openxmlformats.org/drawingml/2006/picture" xmlns:c="http://schemas.openxmlformats.org/drawingml/2006/chart" xmlns:lc="http://schemas.openxmlformats.org/drawingml/2006/lockedCanvas" xmlns:dgm="http://schemas.openxmlformats.org/drawingml/2006/diagram" xmlns:wps="http://schemas.microsoft.com/office/word/2010/wordprocessingShape" xmlns:wpg="http://schemas.microsoft.com/office/word/2010/wordprocessingGroup" xmlns:w14="http://schemas.microsoft.com/office/word/2010/wordml" xmlns:w15="http://schemas.microsoft.com/office/word/2012/wordml" xmlns:w16="http://schemas.microsoft.com/office/word/2018/wordml" xmlns:w16cex="http://schemas.microsoft.com/office/word/2018/wordml/cex" xmlns:w16cid="http://schemas.microsoft.com/office/word/2016/wordml/cid" xmlns="http://schemas.microsoft.com/office/tasks/2019/documenttasks" xmlns:cr="http://schemas.microsoft.com/office/comments/2020/reactions">
+<w:styles xmlns:mc="http://schemas.openxmlformats.org/markup-compatibility/2006" xmlns:r="http://schemas.openxmlformats.org/officeDocument/2006/relationships" xmlns:w="http://schemas.openxmlformats.org/wordprocessingml/2006/main" xmlns:w14="http://schemas.microsoft.com/office/word/2010/wordml" xmlns:w15="http://schemas.microsoft.com/office/word/2012/wordml" xmlns:w16cid="http://schemas.microsoft.com/office/word/2016/wordml/cid" xmlns:w16se="http://schemas.microsoft.com/office/word/2015/wordml/symex" mc:Ignorable="w14 w15 w16se w16cid">
   <w:docDefaults>
     <w:rPrDefault>
       <w:rPr>
-        <w:rFonts w:ascii="Arial" w:cs="Arial" w:eastAsia="Arial" w:hAnsi="Arial"/>
+        <w:rFonts w:ascii="Arial" w:eastAsia="Arial" w:hAnsi="Arial" w:cs="Arial"/>
         <w:sz w:val="22"/>
         <w:szCs w:val="22"/>
-        <w:lang w:val="en"/>
+        <w:lang w:val="en" w:eastAsia="pt-BR" w:bidi="ar-SA"/>
       </w:rPr>
     </w:rPrDefault>
     <w:pPrDefault>
@@ -1178,79 +1349,454 @@
       </w:pPr>
     </w:pPrDefault>
   </w:docDefaults>
-  <w:style w:type="table" w:styleId="TableNormal" w:default="1">
-    <w:name w:val="TableNormal"/>
-    <w:tblPr>
-      <w:tblCellMar>
-        <w:top w:w="100.0" w:type="dxa"/>
-        <w:left w:w="100.0" w:type="dxa"/>
-        <w:bottom w:w="100.0" w:type="dxa"/>
-        <w:right w:w="100.0" w:type="dxa"/>
-      </w:tblCellMar>
-    </w:tblPr>
+  <w:latentStyles w:defLockedState="0" w:defUIPriority="99" w:defSemiHidden="0" w:defUnhideWhenUsed="0" w:defQFormat="0" w:count="375">
+    <w:lsdException w:name="Normal" w:uiPriority="0" w:qFormat="1"/>
+    <w:lsdException w:name="heading 1" w:uiPriority="9" w:qFormat="1"/>
+    <w:lsdException w:name="heading 2" w:semiHidden="1" w:uiPriority="9" w:unhideWhenUsed="1" w:qFormat="1"/>
+    <w:lsdException w:name="heading 3" w:semiHidden="1" w:uiPriority="9" w:unhideWhenUsed="1" w:qFormat="1"/>
+    <w:lsdException w:name="heading 4" w:semiHidden="1" w:uiPriority="9" w:unhideWhenUsed="1" w:qFormat="1"/>
+    <w:lsdException w:name="heading 5" w:semiHidden="1" w:uiPriority="9" w:unhideWhenUsed="1" w:qFormat="1"/>
+    <w:lsdException w:name="heading 6" w:semiHidden="1" w:uiPriority="9" w:unhideWhenUsed="1" w:qFormat="1"/>
+    <w:lsdException w:name="heading 7" w:semiHidden="1" w:uiPriority="9" w:unhideWhenUsed="1" w:qFormat="1"/>
+    <w:lsdException w:name="heading 8" w:semiHidden="1" w:uiPriority="9" w:unhideWhenUsed="1" w:qFormat="1"/>
+    <w:lsdException w:name="heading 9" w:semiHidden="1" w:uiPriority="9" w:unhideWhenUsed="1" w:qFormat="1"/>
+    <w:lsdException w:name="index 1" w:semiHidden="1" w:unhideWhenUsed="1"/>
+    <w:lsdException w:name="index 2" w:semiHidden="1" w:unhideWhenUsed="1"/>
+    <w:lsdException w:name="index 3" w:semiHidden="1" w:unhideWhenUsed="1"/>
+    <w:lsdException w:name="index 4" w:semiHidden="1" w:unhideWhenUsed="1"/>
+    <w:lsdException w:name="index 5" w:semiHidden="1" w:unhideWhenUsed="1"/>
+    <w:lsdException w:name="index 6" w:semiHidden="1" w:unhideWhenUsed="1"/>
+    <w:lsdException w:name="index 7" w:semiHidden="1" w:unhideWhenUsed="1"/>
+    <w:lsdException w:name="index 8" w:semiHidden="1" w:unhideWhenUsed="1"/>
+    <w:lsdException w:name="index 9" w:semiHidden="1" w:unhideWhenUsed="1"/>
+    <w:lsdException w:name="toc 1" w:semiHidden="1" w:uiPriority="39" w:unhideWhenUsed="1"/>
+    <w:lsdException w:name="toc 2" w:semiHidden="1" w:uiPriority="39" w:unhideWhenUsed="1"/>
+    <w:lsdException w:name="toc 3" w:semiHidden="1" w:uiPriority="39" w:unhideWhenUsed="1"/>
+    <w:lsdException w:name="toc 4" w:semiHidden="1" w:uiPriority="39" w:unhideWhenUsed="1"/>
+    <w:lsdException w:name="toc 5" w:semiHidden="1" w:uiPriority="39" w:unhideWhenUsed="1"/>
+    <w:lsdException w:name="toc 6" w:semiHidden="1" w:uiPriority="39" w:unhideWhenUsed="1"/>
+    <w:lsdException w:name="toc 7" w:semiHidden="1" w:uiPriority="39" w:unhideWhenUsed="1"/>
+    <w:lsdException w:name="toc 8" w:semiHidden="1" w:uiPriority="39" w:unhideWhenUsed="1"/>
+    <w:lsdException w:name="toc 9" w:semiHidden="1" w:uiPriority="39" w:unhideWhenUsed="1"/>
+    <w:lsdException w:name="Normal Indent" w:semiHidden="1" w:unhideWhenUsed="1"/>
+    <w:lsdException w:name="footnote text" w:semiHidden="1" w:unhideWhenUsed="1"/>
+    <w:lsdException w:name="annotation text" w:semiHidden="1" w:unhideWhenUsed="1"/>
+    <w:lsdException w:name="header" w:semiHidden="1" w:unhideWhenUsed="1"/>
+    <w:lsdException w:name="footer" w:semiHidden="1" w:unhideWhenUsed="1"/>
+    <w:lsdException w:name="index heading" w:semiHidden="1" w:unhideWhenUsed="1"/>
+    <w:lsdException w:name="caption" w:semiHidden="1" w:uiPriority="35" w:unhideWhenUsed="1" w:qFormat="1"/>
+    <w:lsdException w:name="table of figures" w:semiHidden="1" w:unhideWhenUsed="1"/>
+    <w:lsdException w:name="envelope address" w:semiHidden="1" w:unhideWhenUsed="1"/>
+    <w:lsdException w:name="envelope return" w:semiHidden="1" w:unhideWhenUsed="1"/>
+    <w:lsdException w:name="footnote reference" w:semiHidden="1" w:unhideWhenUsed="1"/>
+    <w:lsdException w:name="annotation reference" w:semiHidden="1" w:unhideWhenUsed="1"/>
+    <w:lsdException w:name="line number" w:semiHidden="1" w:unhideWhenUsed="1"/>
+    <w:lsdException w:name="page number" w:semiHidden="1" w:unhideWhenUsed="1"/>
+    <w:lsdException w:name="endnote reference" w:semiHidden="1" w:unhideWhenUsed="1"/>
+    <w:lsdException w:name="endnote text" w:semiHidden="1" w:unhideWhenUsed="1"/>
+    <w:lsdException w:name="table of authorities" w:semiHidden="1" w:unhideWhenUsed="1"/>
+    <w:lsdException w:name="macro" w:semiHidden="1" w:unhideWhenUsed="1"/>
+    <w:lsdException w:name="toa heading" w:semiHidden="1" w:unhideWhenUsed="1"/>
+    <w:lsdException w:name="List" w:semiHidden="1" w:unhideWhenUsed="1"/>
+    <w:lsdException w:name="List Bullet" w:semiHidden="1" w:unhideWhenUsed="1"/>
+    <w:lsdException w:name="List Number" w:semiHidden="1" w:unhideWhenUsed="1"/>
+    <w:lsdException w:name="List 2" w:semiHidden="1" w:unhideWhenUsed="1"/>
+    <w:lsdException w:name="List 3" w:semiHidden="1" w:unhideWhenUsed="1"/>
+    <w:lsdException w:name="List 4" w:semiHidden="1" w:unhideWhenUsed="1"/>
+    <w:lsdException w:name="List 5" w:semiHidden="1" w:unhideWhenUsed="1"/>
+    <w:lsdException w:name="List Bullet 2" w:semiHidden="1" w:unhideWhenUsed="1"/>
+    <w:lsdException w:name="List Bullet 3" w:semiHidden="1" w:unhideWhenUsed="1"/>
+    <w:lsdException w:name="List Bullet 4" w:semiHidden="1" w:unhideWhenUsed="1"/>
+    <w:lsdException w:name="List Bullet 5" w:semiHidden="1" w:unhideWhenUsed="1"/>
+    <w:lsdException w:name="List Number 2" w:semiHidden="1" w:unhideWhenUsed="1"/>
+    <w:lsdException w:name="List Number 3" w:semiHidden="1" w:unhideWhenUsed="1"/>
+    <w:lsdException w:name="List Number 4" w:semiHidden="1" w:unhideWhenUsed="1"/>
+    <w:lsdException w:name="List Number 5" w:semiHidden="1" w:unhideWhenUsed="1"/>
+    <w:lsdException w:name="Title" w:uiPriority="10" w:qFormat="1"/>
+    <w:lsdException w:name="Closing" w:semiHidden="1" w:unhideWhenUsed="1"/>
+    <w:lsdException w:name="Signature" w:semiHidden="1" w:unhideWhenUsed="1"/>
+    <w:lsdException w:name="Default Paragraph Font" w:semiHidden="1" w:uiPriority="1" w:unhideWhenUsed="1"/>
+    <w:lsdException w:name="Body Text" w:semiHidden="1" w:unhideWhenUsed="1"/>
+    <w:lsdException w:name="Body Text Indent" w:semiHidden="1" w:unhideWhenUsed="1"/>
+    <w:lsdException w:name="List Continue" w:semiHidden="1" w:unhideWhenUsed="1"/>
+    <w:lsdException w:name="List Continue 2" w:semiHidden="1" w:unhideWhenUsed="1"/>
+    <w:lsdException w:name="List Continue 3" w:semiHidden="1" w:unhideWhenUsed="1"/>
+    <w:lsdException w:name="List Continue 4" w:semiHidden="1" w:unhideWhenUsed="1"/>
+    <w:lsdException w:name="List Continue 5" w:semiHidden="1" w:unhideWhenUsed="1"/>
+    <w:lsdException w:name="Message Header" w:semiHidden="1" w:unhideWhenUsed="1"/>
+    <w:lsdException w:name="Subtitle" w:uiPriority="11" w:qFormat="1"/>
+    <w:lsdException w:name="Salutation" w:semiHidden="1" w:unhideWhenUsed="1"/>
+    <w:lsdException w:name="Date" w:semiHidden="1" w:unhideWhenUsed="1"/>
+    <w:lsdException w:name="Body Text First Indent" w:semiHidden="1" w:unhideWhenUsed="1"/>
+    <w:lsdException w:name="Body Text First Indent 2" w:semiHidden="1" w:unhideWhenUsed="1"/>
+    <w:lsdException w:name="Note Heading" w:semiHidden="1" w:unhideWhenUsed="1"/>
+    <w:lsdException w:name="Body Text 2" w:semiHidden="1" w:unhideWhenUsed="1"/>
+    <w:lsdException w:name="Body Text 3" w:semiHidden="1" w:unhideWhenUsed="1"/>
+    <w:lsdException w:name="Body Text Indent 2" w:semiHidden="1" w:unhideWhenUsed="1"/>
+    <w:lsdException w:name="Body Text Indent 3" w:semiHidden="1" w:unhideWhenUsed="1"/>
+    <w:lsdException w:name="Block Text" w:semiHidden="1" w:unhideWhenUsed="1"/>
+    <w:lsdException w:name="Hyperlink" w:semiHidden="1" w:unhideWhenUsed="1"/>
+    <w:lsdException w:name="FollowedHyperlink" w:semiHidden="1" w:unhideWhenUsed="1"/>
+    <w:lsdException w:name="Strong" w:uiPriority="22" w:qFormat="1"/>
+    <w:lsdException w:name="Emphasis" w:uiPriority="20" w:qFormat="1"/>
+    <w:lsdException w:name="Document Map" w:semiHidden="1" w:unhideWhenUsed="1"/>
+    <w:lsdException w:name="Plain Text" w:semiHidden="1" w:unhideWhenUsed="1"/>
+    <w:lsdException w:name="E-mail Signature" w:semiHidden="1" w:unhideWhenUsed="1"/>
+    <w:lsdException w:name="HTML Top of Form" w:semiHidden="1" w:unhideWhenUsed="1"/>
+    <w:lsdException w:name="HTML Bottom of Form" w:semiHidden="1" w:unhideWhenUsed="1"/>
+    <w:lsdException w:name="Normal (Web)" w:semiHidden="1" w:unhideWhenUsed="1"/>
+    <w:lsdException w:name="HTML Acronym" w:semiHidden="1" w:unhideWhenUsed="1"/>
+    <w:lsdException w:name="HTML Address" w:semiHidden="1" w:unhideWhenUsed="1"/>
+    <w:lsdException w:name="HTML Cite" w:semiHidden="1" w:unhideWhenUsed="1"/>
+    <w:lsdException w:name="HTML Code" w:semiHidden="1" w:unhideWhenUsed="1"/>
+    <w:lsdException w:name="HTML Definition" w:semiHidden="1" w:unhideWhenUsed="1"/>
+    <w:lsdException w:name="HTML Keyboard" w:semiHidden="1" w:unhideWhenUsed="1"/>
+    <w:lsdException w:name="HTML Preformatted" w:semiHidden="1" w:unhideWhenUsed="1"/>
+    <w:lsdException w:name="HTML Sample" w:semiHidden="1" w:unhideWhenUsed="1"/>
+    <w:lsdException w:name="HTML Typewriter" w:semiHidden="1" w:unhideWhenUsed="1"/>
+    <w:lsdException w:name="HTML Variable" w:semiHidden="1" w:unhideWhenUsed="1"/>
+    <w:lsdException w:name="Normal Table" w:semiHidden="1" w:unhideWhenUsed="1"/>
+    <w:lsdException w:name="annotation subject" w:semiHidden="1" w:unhideWhenUsed="1"/>
+    <w:lsdException w:name="No List" w:semiHidden="1" w:unhideWhenUsed="1"/>
+    <w:lsdException w:name="Outline List 1" w:semiHidden="1" w:unhideWhenUsed="1"/>
+    <w:lsdException w:name="Outline List 2" w:semiHidden="1" w:unhideWhenUsed="1"/>
+    <w:lsdException w:name="Outline List 3" w:semiHidden="1" w:unhideWhenUsed="1"/>
+    <w:lsdException w:name="Table Simple 1" w:semiHidden="1" w:unhideWhenUsed="1"/>
+    <w:lsdException w:name="Table Simple 2" w:semiHidden="1" w:unhideWhenUsed="1"/>
+    <w:lsdException w:name="Table Simple 3" w:semiHidden="1" w:unhideWhenUsed="1"/>
+    <w:lsdException w:name="Table Classic 1" w:semiHidden="1" w:unhideWhenUsed="1"/>
+    <w:lsdException w:name="Table Classic 2" w:semiHidden="1" w:unhideWhenUsed="1"/>
+    <w:lsdException w:name="Table Classic 3" w:semiHidden="1" w:unhideWhenUsed="1"/>
+    <w:lsdException w:name="Table Classic 4" w:semiHidden="1" w:unhideWhenUsed="1"/>
+    <w:lsdException w:name="Table Colorful 1" w:semiHidden="1" w:unhideWhenUsed="1"/>
+    <w:lsdException w:name="Table Colorful 2" w:semiHidden="1" w:unhideWhenUsed="1"/>
+    <w:lsdException w:name="Table Colorful 3" w:semiHidden="1" w:unhideWhenUsed="1"/>
+    <w:lsdException w:name="Table Columns 1" w:semiHidden="1" w:unhideWhenUsed="1"/>
+    <w:lsdException w:name="Table Columns 2" w:semiHidden="1" w:unhideWhenUsed="1"/>
+    <w:lsdException w:name="Table Columns 3" w:semiHidden="1" w:unhideWhenUsed="1"/>
+    <w:lsdException w:name="Table Columns 4" w:semiHidden="1" w:unhideWhenUsed="1"/>
+    <w:lsdException w:name="Table Columns 5" w:semiHidden="1" w:unhideWhenUsed="1"/>
+    <w:lsdException w:name="Table Grid 1" w:semiHidden="1" w:unhideWhenUsed="1"/>
+    <w:lsdException w:name="Table Grid 2" w:semiHidden="1" w:unhideWhenUsed="1"/>
+    <w:lsdException w:name="Table Grid 3" w:semiHidden="1" w:unhideWhenUsed="1"/>
+    <w:lsdException w:name="Table Grid 4" w:semiHidden="1" w:unhideWhenUsed="1"/>
+    <w:lsdException w:name="Table Grid 5" w:semiHidden="1" w:unhideWhenUsed="1"/>
+    <w:lsdException w:name="Table Grid 6" w:semiHidden="1" w:unhideWhenUsed="1"/>
+    <w:lsdException w:name="Table Grid 7" w:semiHidden="1" w:unhideWhenUsed="1"/>
+    <w:lsdException w:name="Table Grid 8" w:semiHidden="1" w:unhideWhenUsed="1"/>
+    <w:lsdException w:name="Table List 1" w:semiHidden="1" w:unhideWhenUsed="1"/>
+    <w:lsdException w:name="Table List 2" w:semiHidden="1" w:unhideWhenUsed="1"/>
+    <w:lsdException w:name="Table List 3" w:semiHidden="1" w:unhideWhenUsed="1"/>
+    <w:lsdException w:name="Table List 4" w:semiHidden="1" w:unhideWhenUsed="1"/>
+    <w:lsdException w:name="Table List 5" w:semiHidden="1" w:unhideWhenUsed="1"/>
+    <w:lsdException w:name="Table List 6" w:semiHidden="1" w:unhideWhenUsed="1"/>
+    <w:lsdException w:name="Table List 7" w:semiHidden="1" w:unhideWhenUsed="1"/>
+    <w:lsdException w:name="Table List 8" w:semiHidden="1" w:unhideWhenUsed="1"/>
+    <w:lsdException w:name="Table 3D effects 1" w:semiHidden="1" w:unhideWhenUsed="1"/>
+    <w:lsdException w:name="Table 3D effects 2" w:semiHidden="1" w:unhideWhenUsed="1"/>
+    <w:lsdException w:name="Table 3D effects 3" w:semiHidden="1" w:unhideWhenUsed="1"/>
+    <w:lsdException w:name="Table Contemporary" w:semiHidden="1" w:unhideWhenUsed="1"/>
+    <w:lsdException w:name="Table Elegant" w:semiHidden="1" w:unhideWhenUsed="1"/>
+    <w:lsdException w:name="Table Professional" w:semiHidden="1" w:unhideWhenUsed="1"/>
+    <w:lsdException w:name="Table Subtle 1" w:semiHidden="1" w:unhideWhenUsed="1"/>
+    <w:lsdException w:name="Table Subtle 2" w:semiHidden="1" w:unhideWhenUsed="1"/>
+    <w:lsdException w:name="Table Web 1" w:semiHidden="1" w:unhideWhenUsed="1"/>
+    <w:lsdException w:name="Table Web 2" w:semiHidden="1" w:unhideWhenUsed="1"/>
+    <w:lsdException w:name="Table Web 3" w:semiHidden="1" w:unhideWhenUsed="1"/>
+    <w:lsdException w:name="Balloon Text" w:semiHidden="1" w:unhideWhenUsed="1"/>
+    <w:lsdException w:name="Table Grid" w:uiPriority="39"/>
+    <w:lsdException w:name="Table Theme" w:semiHidden="1" w:unhideWhenUsed="1"/>
+    <w:lsdException w:name="Placeholder Text" w:semiHidden="1"/>
+    <w:lsdException w:name="No Spacing" w:uiPriority="1" w:qFormat="1"/>
+    <w:lsdException w:name="Light Shading" w:uiPriority="60"/>
+    <w:lsdException w:name="Light List" w:uiPriority="61"/>
+    <w:lsdException w:name="Light Grid" w:uiPriority="62"/>
+    <w:lsdException w:name="Medium Shading 1" w:uiPriority="63"/>
+    <w:lsdException w:name="Medium Shading 2" w:uiPriority="64"/>
+    <w:lsdException w:name="Medium List 1" w:uiPriority="65"/>
+    <w:lsdException w:name="Medium List 2" w:uiPriority="66"/>
+    <w:lsdException w:name="Medium Grid 1" w:uiPriority="67"/>
+    <w:lsdException w:name="Medium Grid 2" w:uiPriority="68"/>
+    <w:lsdException w:name="Medium Grid 3" w:uiPriority="69"/>
+    <w:lsdException w:name="Dark List" w:uiPriority="70"/>
+    <w:lsdException w:name="Colorful Shading" w:uiPriority="71"/>
+    <w:lsdException w:name="Colorful List" w:uiPriority="72"/>
+    <w:lsdException w:name="Colorful Grid" w:uiPriority="73"/>
+    <w:lsdException w:name="Light Shading Accent 1" w:uiPriority="60"/>
+    <w:lsdException w:name="Light List Accent 1" w:uiPriority="61"/>
+    <w:lsdException w:name="Light Grid Accent 1" w:uiPriority="62"/>
+    <w:lsdException w:name="Medium Shading 1 Accent 1" w:uiPriority="63"/>
+    <w:lsdException w:name="Medium Shading 2 Accent 1" w:uiPriority="64"/>
+    <w:lsdException w:name="Medium List 1 Accent 1" w:uiPriority="65"/>
+    <w:lsdException w:name="Revision" w:semiHidden="1"/>
+    <w:lsdException w:name="List Paragraph" w:uiPriority="34" w:qFormat="1"/>
+    <w:lsdException w:name="Quote" w:uiPriority="29" w:qFormat="1"/>
+    <w:lsdException w:name="Intense Quote" w:uiPriority="30" w:qFormat="1"/>
+    <w:lsdException w:name="Medium List 2 Accent 1" w:uiPriority="66"/>
+    <w:lsdException w:name="Medium Grid 1 Accent 1" w:uiPriority="67"/>
+    <w:lsdException w:name="Medium Grid 2 Accent 1" w:uiPriority="68"/>
+    <w:lsdException w:name="Medium Grid 3 Accent 1" w:uiPriority="69"/>
+    <w:lsdException w:name="Dark List Accent 1" w:uiPriority="70"/>
+    <w:lsdException w:name="Colorful Shading Accent 1" w:uiPriority="71"/>
+    <w:lsdException w:name="Colorful List Accent 1" w:uiPriority="72"/>
+    <w:lsdException w:name="Colorful Grid Accent 1" w:uiPriority="73"/>
+    <w:lsdException w:name="Light Shading Accent 2" w:uiPriority="60"/>
+    <w:lsdException w:name="Light List Accent 2" w:uiPriority="61"/>
+    <w:lsdException w:name="Light Grid Accent 2" w:uiPriority="62"/>
+    <w:lsdException w:name="Medium Shading 1 Accent 2" w:uiPriority="63"/>
+    <w:lsdException w:name="Medium Shading 2 Accent 2" w:uiPriority="64"/>
+    <w:lsdException w:name="Medium List 1 Accent 2" w:uiPriority="65"/>
+    <w:lsdException w:name="Medium List 2 Accent 2" w:uiPriority="66"/>
+    <w:lsdException w:name="Medium Grid 1 Accent 2" w:uiPriority="67"/>
+    <w:lsdException w:name="Medium Grid 2 Accent 2" w:uiPriority="68"/>
+    <w:lsdException w:name="Medium Grid 3 Accent 2" w:uiPriority="69"/>
+    <w:lsdException w:name="Dark List Accent 2" w:uiPriority="70"/>
+    <w:lsdException w:name="Colorful Shading Accent 2" w:uiPriority="71"/>
+    <w:lsdException w:name="Colorful List Accent 2" w:uiPriority="72"/>
+    <w:lsdException w:name="Colorful Grid Accent 2" w:uiPriority="73"/>
+    <w:lsdException w:name="Light Shading Accent 3" w:uiPriority="60"/>
+    <w:lsdException w:name="Light List Accent 3" w:uiPriority="61"/>
+    <w:lsdException w:name="Light Grid Accent 3" w:uiPriority="62"/>
+    <w:lsdException w:name="Medium Shading 1 Accent 3" w:uiPriority="63"/>
+    <w:lsdException w:name="Medium Shading 2 Accent 3" w:uiPriority="64"/>
+    <w:lsdException w:name="Medium List 1 Accent 3" w:uiPriority="65"/>
+    <w:lsdException w:name="Medium List 2 Accent 3" w:uiPriority="66"/>
+    <w:lsdException w:name="Medium Grid 1 Accent 3" w:uiPriority="67"/>
+    <w:lsdException w:name="Medium Grid 2 Accent 3" w:uiPriority="68"/>
+    <w:lsdException w:name="Medium Grid 3 Accent 3" w:uiPriority="69"/>
+    <w:lsdException w:name="Dark List Accent 3" w:uiPriority="70"/>
+    <w:lsdException w:name="Colorful Shading Accent 3" w:uiPriority="71"/>
+    <w:lsdException w:name="Colorful List Accent 3" w:uiPriority="72"/>
+    <w:lsdException w:name="Colorful Grid Accent 3" w:uiPriority="73"/>
+    <w:lsdException w:name="Light Shading Accent 4" w:uiPriority="60"/>
+    <w:lsdException w:name="Light List Accent 4" w:uiPriority="61"/>
+    <w:lsdException w:name="Light Grid Accent 4" w:uiPriority="62"/>
+    <w:lsdException w:name="Medium Shading 1 Accent 4" w:uiPriority="63"/>
+    <w:lsdException w:name="Medium Shading 2 Accent 4" w:uiPriority="64"/>
+    <w:lsdException w:name="Medium List 1 Accent 4" w:uiPriority="65"/>
+    <w:lsdException w:name="Medium List 2 Accent 4" w:uiPriority="66"/>
+    <w:lsdException w:name="Medium Grid 1 Accent 4" w:uiPriority="67"/>
+    <w:lsdException w:name="Medium Grid 2 Accent 4" w:uiPriority="68"/>
+    <w:lsdException w:name="Medium Grid 3 Accent 4" w:uiPriority="69"/>
+    <w:lsdException w:name="Dark List Accent 4" w:uiPriority="70"/>
+    <w:lsdException w:name="Colorful Shading Accent 4" w:uiPriority="71"/>
+    <w:lsdException w:name="Colorful List Accent 4" w:uiPriority="72"/>
+    <w:lsdException w:name="Colorful Grid Accent 4" w:uiPriority="73"/>
+    <w:lsdException w:name="Light Shading Accent 5" w:uiPriority="60"/>
+    <w:lsdException w:name="Light List Accent 5" w:uiPriority="61"/>
+    <w:lsdException w:name="Light Grid Accent 5" w:uiPriority="62"/>
+    <w:lsdException w:name="Medium Shading 1 Accent 5" w:uiPriority="63"/>
+    <w:lsdException w:name="Medium Shading 2 Accent 5" w:uiPriority="64"/>
+    <w:lsdException w:name="Medium List 1 Accent 5" w:uiPriority="65"/>
+    <w:lsdException w:name="Medium List 2 Accent 5" w:uiPriority="66"/>
+    <w:lsdException w:name="Medium Grid 1 Accent 5" w:uiPriority="67"/>
+    <w:lsdException w:name="Medium Grid 2 Accent 5" w:uiPriority="68"/>
+    <w:lsdException w:name="Medium Grid 3 Accent 5" w:uiPriority="69"/>
+    <w:lsdException w:name="Dark List Accent 5" w:uiPriority="70"/>
+    <w:lsdException w:name="Colorful Shading Accent 5" w:uiPriority="71"/>
+    <w:lsdException w:name="Colorful List Accent 5" w:uiPriority="72"/>
+    <w:lsdException w:name="Colorful Grid Accent 5" w:uiPriority="73"/>
+    <w:lsdException w:name="Light Shading Accent 6" w:uiPriority="60"/>
+    <w:lsdException w:name="Light List Accent 6" w:uiPriority="61"/>
+    <w:lsdException w:name="Light Grid Accent 6" w:uiPriority="62"/>
+    <w:lsdException w:name="Medium Shading 1 Accent 6" w:uiPriority="63"/>
+    <w:lsdException w:name="Medium Shading 2 Accent 6" w:uiPriority="64"/>
+    <w:lsdException w:name="Medium List 1 Accent 6" w:uiPriority="65"/>
+    <w:lsdException w:name="Medium List 2 Accent 6" w:uiPriority="66"/>
+    <w:lsdException w:name="Medium Grid 1 Accent 6" w:uiPriority="67"/>
+    <w:lsdException w:name="Medium Grid 2 Accent 6" w:uiPriority="68"/>
+    <w:lsdException w:name="Medium Grid 3 Accent 6" w:uiPriority="69"/>
+    <w:lsdException w:name="Dark List Accent 6" w:uiPriority="70"/>
+    <w:lsdException w:name="Colorful Shading Accent 6" w:uiPriority="71"/>
+    <w:lsdException w:name="Colorful List Accent 6" w:uiPriority="72"/>
+    <w:lsdException w:name="Colorful Grid Accent 6" w:uiPriority="73"/>
+    <w:lsdException w:name="Subtle Emphasis" w:uiPriority="19" w:qFormat="1"/>
+    <w:lsdException w:name="Intense Emphasis" w:uiPriority="21" w:qFormat="1"/>
+    <w:lsdException w:name="Subtle Reference" w:uiPriority="31" w:qFormat="1"/>
+    <w:lsdException w:name="Intense Reference" w:uiPriority="32" w:qFormat="1"/>
+    <w:lsdException w:name="Book Title" w:uiPriority="33" w:qFormat="1"/>
+    <w:lsdException w:name="Bibliography" w:semiHidden="1" w:uiPriority="37" w:unhideWhenUsed="1"/>
+    <w:lsdException w:name="TOC Heading" w:semiHidden="1" w:uiPriority="39" w:unhideWhenUsed="1" w:qFormat="1"/>
+    <w:lsdException w:name="Plain Table 1" w:uiPriority="41"/>
+    <w:lsdException w:name="Plain Table 2" w:uiPriority="42"/>
+    <w:lsdException w:name="Plain Table 3" w:uiPriority="43"/>
+    <w:lsdException w:name="Plain Table 4" w:uiPriority="44"/>
+    <w:lsdException w:name="Plain Table 5" w:uiPriority="45"/>
+    <w:lsdException w:name="Grid Table Light" w:uiPriority="40"/>
+    <w:lsdException w:name="Grid Table 1 Light" w:uiPriority="46"/>
+    <w:lsdException w:name="Grid Table 2" w:uiPriority="47"/>
+    <w:lsdException w:name="Grid Table 3" w:uiPriority="48"/>
+    <w:lsdException w:name="Grid Table 4" w:uiPriority="49"/>
+    <w:lsdException w:name="Grid Table 5 Dark" w:uiPriority="50"/>
+    <w:lsdException w:name="Grid Table 6 Colorful" w:uiPriority="51"/>
+    <w:lsdException w:name="Grid Table 7 Colorful" w:uiPriority="52"/>
+    <w:lsdException w:name="Grid Table 1 Light Accent 1" w:uiPriority="46"/>
+    <w:lsdException w:name="Grid Table 2 Accent 1" w:uiPriority="47"/>
+    <w:lsdException w:name="Grid Table 3 Accent 1" w:uiPriority="48"/>
+    <w:lsdException w:name="Grid Table 4 Accent 1" w:uiPriority="49"/>
+    <w:lsdException w:name="Grid Table 5 Dark Accent 1" w:uiPriority="50"/>
+    <w:lsdException w:name="Grid Table 6 Colorful Accent 1" w:uiPriority="51"/>
+    <w:lsdException w:name="Grid Table 7 Colorful Accent 1" w:uiPriority="52"/>
+    <w:lsdException w:name="Grid Table 1 Light Accent 2" w:uiPriority="46"/>
+    <w:lsdException w:name="Grid Table 2 Accent 2" w:uiPriority="47"/>
+    <w:lsdException w:name="Grid Table 3 Accent 2" w:uiPriority="48"/>
+    <w:lsdException w:name="Grid Table 4 Accent 2" w:uiPriority="49"/>
+    <w:lsdException w:name="Grid Table 5 Dark Accent 2" w:uiPriority="50"/>
+    <w:lsdException w:name="Grid Table 6 Colorful Accent 2" w:uiPriority="51"/>
+    <w:lsdException w:name="Grid Table 7 Colorful Accent 2" w:uiPriority="52"/>
+    <w:lsdException w:name="Grid Table 1 Light Accent 3" w:uiPriority="46"/>
+    <w:lsdException w:name="Grid Table 2 Accent 3" w:uiPriority="47"/>
+    <w:lsdException w:name="Grid Table 3 Accent 3" w:uiPriority="48"/>
+    <w:lsdException w:name="Grid Table 4 Accent 3" w:uiPriority="49"/>
+    <w:lsdException w:name="Grid Table 5 Dark Accent 3" w:uiPriority="50"/>
+    <w:lsdException w:name="Grid Table 6 Colorful Accent 3" w:uiPriority="51"/>
+    <w:lsdException w:name="Grid Table 7 Colorful Accent 3" w:uiPriority="52"/>
+    <w:lsdException w:name="Grid Table 1 Light Accent 4" w:uiPriority="46"/>
+    <w:lsdException w:name="Grid Table 2 Accent 4" w:uiPriority="47"/>
+    <w:lsdException w:name="Grid Table 3 Accent 4" w:uiPriority="48"/>
+    <w:lsdException w:name="Grid Table 4 Accent 4" w:uiPriority="49"/>
+    <w:lsdException w:name="Grid Table 5 Dark Accent 4" w:uiPriority="50"/>
+    <w:lsdException w:name="Grid Table 6 Colorful Accent 4" w:uiPriority="51"/>
+    <w:lsdException w:name="Grid Table 7 Colorful Accent 4" w:uiPriority="52"/>
+    <w:lsdException w:name="Grid Table 1 Light Accent 5" w:uiPriority="46"/>
+    <w:lsdException w:name="Grid Table 2 Accent 5" w:uiPriority="47"/>
+    <w:lsdException w:name="Grid Table 3 Accent 5" w:uiPriority="48"/>
+    <w:lsdException w:name="Grid Table 4 Accent 5" w:uiPriority="49"/>
+    <w:lsdException w:name="Grid Table 5 Dark Accent 5" w:uiPriority="50"/>
+    <w:lsdException w:name="Grid Table 6 Colorful Accent 5" w:uiPriority="51"/>
+    <w:lsdException w:name="Grid Table 7 Colorful Accent 5" w:uiPriority="52"/>
+    <w:lsdException w:name="Grid Table 1 Light Accent 6" w:uiPriority="46"/>
+    <w:lsdException w:name="Grid Table 2 Accent 6" w:uiPriority="47"/>
+    <w:lsdException w:name="Grid Table 3 Accent 6" w:uiPriority="48"/>
+    <w:lsdException w:name="Grid Table 4 Accent 6" w:uiPriority="49"/>
+    <w:lsdException w:name="Grid Table 5 Dark Accent 6" w:uiPriority="50"/>
+    <w:lsdException w:name="Grid Table 6 Colorful Accent 6" w:uiPriority="51"/>
+    <w:lsdException w:name="Grid Table 7 Colorful Accent 6" w:uiPriority="52"/>
+    <w:lsdException w:name="List Table 1 Light" w:uiPriority="46"/>
+    <w:lsdException w:name="List Table 2" w:uiPriority="47"/>
+    <w:lsdException w:name="List Table 3" w:uiPriority="48"/>
+    <w:lsdException w:name="List Table 4" w:uiPriority="49"/>
+    <w:lsdException w:name="List Table 5 Dark" w:uiPriority="50"/>
+    <w:lsdException w:name="List Table 6 Colorful" w:uiPriority="51"/>
+    <w:lsdException w:name="List Table 7 Colorful" w:uiPriority="52"/>
+    <w:lsdException w:name="List Table 1 Light Accent 1" w:uiPriority="46"/>
+    <w:lsdException w:name="List Table 2 Accent 1" w:uiPriority="47"/>
+    <w:lsdException w:name="List Table 3 Accent 1" w:uiPriority="48"/>
+    <w:lsdException w:name="List Table 4 Accent 1" w:uiPriority="49"/>
+    <w:lsdException w:name="List Table 5 Dark Accent 1" w:uiPriority="50"/>
+    <w:lsdException w:name="List Table 6 Colorful Accent 1" w:uiPriority="51"/>
+    <w:lsdException w:name="List Table 7 Colorful Accent 1" w:uiPriority="52"/>
+    <w:lsdException w:name="List Table 1 Light Accent 2" w:uiPriority="46"/>
+    <w:lsdException w:name="List Table 2 Accent 2" w:uiPriority="47"/>
+    <w:lsdException w:name="List Table 3 Accent 2" w:uiPriority="48"/>
+    <w:lsdException w:name="List Table 4 Accent 2" w:uiPriority="49"/>
+    <w:lsdException w:name="List Table 5 Dark Accent 2" w:uiPriority="50"/>
+    <w:lsdException w:name="List Table 6 Colorful Accent 2" w:uiPriority="51"/>
+    <w:lsdException w:name="List Table 7 Colorful Accent 2" w:uiPriority="52"/>
+    <w:lsdException w:name="List Table 1 Light Accent 3" w:uiPriority="46"/>
+    <w:lsdException w:name="List Table 2 Accent 3" w:uiPriority="47"/>
+    <w:lsdException w:name="List Table 3 Accent 3" w:uiPriority="48"/>
+    <w:lsdException w:name="List Table 4 Accent 3" w:uiPriority="49"/>
+    <w:lsdException w:name="List Table 5 Dark Accent 3" w:uiPriority="50"/>
+    <w:lsdException w:name="List Table 6 Colorful Accent 3" w:uiPriority="51"/>
+    <w:lsdException w:name="List Table 7 Colorful Accent 3" w:uiPriority="52"/>
+    <w:lsdException w:name="List Table 1 Light Accent 4" w:uiPriority="46"/>
+    <w:lsdException w:name="List Table 2 Accent 4" w:uiPriority="47"/>
+    <w:lsdException w:name="List Table 3 Accent 4" w:uiPriority="48"/>
+    <w:lsdException w:name="List Table 4 Accent 4" w:uiPriority="49"/>
+    <w:lsdException w:name="List Table 5 Dark Accent 4" w:uiPriority="50"/>
+    <w:lsdException w:name="List Table 6 Colorful Accent 4" w:uiPriority="51"/>
+    <w:lsdException w:name="List Table 7 Colorful Accent 4" w:uiPriority="52"/>
+    <w:lsdException w:name="List Table 1 Light Accent 5" w:uiPriority="46"/>
+    <w:lsdException w:name="List Table 2 Accent 5" w:uiPriority="47"/>
+    <w:lsdException w:name="List Table 3 Accent 5" w:uiPriority="48"/>
+    <w:lsdException w:name="List Table 4 Accent 5" w:uiPriority="49"/>
+    <w:lsdException w:name="List Table 5 Dark Accent 5" w:uiPriority="50"/>
+    <w:lsdException w:name="List Table 6 Colorful Accent 5" w:uiPriority="51"/>
+    <w:lsdException w:name="List Table 7 Colorful Accent 5" w:uiPriority="52"/>
+    <w:lsdException w:name="List Table 1 Light Accent 6" w:uiPriority="46"/>
+    <w:lsdException w:name="List Table 2 Accent 6" w:uiPriority="47"/>
+    <w:lsdException w:name="List Table 3 Accent 6" w:uiPriority="48"/>
+    <w:lsdException w:name="List Table 4 Accent 6" w:uiPriority="49"/>
+    <w:lsdException w:name="List Table 5 Dark Accent 6" w:uiPriority="50"/>
+    <w:lsdException w:name="List Table 6 Colorful Accent 6" w:uiPriority="51"/>
+    <w:lsdException w:name="List Table 7 Colorful Accent 6" w:uiPriority="52"/>
+    <w:lsdException w:name="Mention" w:semiHidden="1" w:unhideWhenUsed="1"/>
+    <w:lsdException w:name="Smart Hyperlink" w:semiHidden="1" w:unhideWhenUsed="1"/>
+    <w:lsdException w:name="Hashtag" w:semiHidden="1" w:unhideWhenUsed="1"/>
+    <w:lsdException w:name="Unresolved Mention" w:semiHidden="1" w:unhideWhenUsed="1"/>
+  </w:latentStyles>
+  <w:style w:type="paragraph" w:default="1" w:styleId="Normal">
+    <w:name w:val="Normal"/>
+    <w:qFormat/>
   </w:style>
-  <w:style w:type="paragraph" w:styleId="Normal" w:default="1">
-    <w:name w:val="normal"/>
-  </w:style>
-  <w:style w:type="paragraph" w:styleId="Heading1">
+  <w:style w:type="paragraph" w:styleId="Ttulo1">
     <w:name w:val="heading 1"/>
     <w:basedOn w:val="Normal"/>
     <w:next w:val="Normal"/>
+    <w:uiPriority w:val="9"/>
+    <w:qFormat/>
     <w:pPr>
-      <w:keepNext w:val="1"/>
-      <w:keepLines w:val="1"/>
-      <w:pageBreakBefore w:val="0"/>
-      <w:spacing w:after="120" w:before="400" w:lineRule="auto"/>
+      <w:keepNext/>
+      <w:keepLines/>
+      <w:spacing w:before="400" w:after="120"/>
+      <w:outlineLvl w:val="0"/>
     </w:pPr>
     <w:rPr>
       <w:sz w:val="40"/>
       <w:szCs w:val="40"/>
     </w:rPr>
   </w:style>
-  <w:style w:type="paragraph" w:styleId="Heading2">
+  <w:style w:type="paragraph" w:styleId="Ttulo2">
     <w:name w:val="heading 2"/>
     <w:basedOn w:val="Normal"/>
     <w:next w:val="Normal"/>
+    <w:uiPriority w:val="9"/>
+    <w:unhideWhenUsed/>
+    <w:qFormat/>
     <w:pPr>
-      <w:keepNext w:val="1"/>
-      <w:keepLines w:val="1"/>
-      <w:pageBreakBefore w:val="0"/>
-      <w:spacing w:after="120" w:before="360" w:lineRule="auto"/>
+      <w:keepNext/>
+      <w:keepLines/>
+      <w:spacing w:before="360" w:after="120"/>
+      <w:outlineLvl w:val="1"/>
     </w:pPr>
     <w:rPr>
-      <w:b w:val="0"/>
-      <w:bCs w:val="0"/>
       <w:sz w:val="32"/>
       <w:szCs w:val="32"/>
     </w:rPr>
   </w:style>
-  <w:style w:type="paragraph" w:styleId="Heading3">
+  <w:style w:type="paragraph" w:styleId="Ttulo3">
     <w:name w:val="heading 3"/>
     <w:basedOn w:val="Normal"/>
     <w:next w:val="Normal"/>
+    <w:uiPriority w:val="9"/>
+    <w:unhideWhenUsed/>
+    <w:qFormat/>
     <w:pPr>
-      <w:keepNext w:val="1"/>
-      <w:keepLines w:val="1"/>
-      <w:pageBreakBefore w:val="0"/>
-      <w:spacing w:after="80" w:before="320" w:lineRule="auto"/>
+      <w:keepNext/>
+      <w:keepLines/>
+      <w:spacing w:before="320" w:after="80"/>
+      <w:outlineLvl w:val="2"/>
     </w:pPr>
     <w:rPr>
-      <w:b w:val="0"/>
-      <w:bCs w:val="0"/>
       <w:color w:val="434343"/>
       <w:sz w:val="28"/>
       <w:szCs w:val="28"/>
     </w:rPr>
   </w:style>
-  <w:style w:type="paragraph" w:styleId="Heading4">
+  <w:style w:type="paragraph" w:styleId="Ttulo4">
     <w:name w:val="heading 4"/>
     <w:basedOn w:val="Normal"/>
     <w:next w:val="Normal"/>
+    <w:uiPriority w:val="9"/>
+    <w:semiHidden/>
+    <w:unhideWhenUsed/>
+    <w:qFormat/>
     <w:pPr>
-      <w:keepNext w:val="1"/>
-      <w:keepLines w:val="1"/>
-      <w:pageBreakBefore w:val="0"/>
-      <w:spacing w:after="80" w:before="280" w:lineRule="auto"/>
+      <w:keepNext/>
+      <w:keepLines/>
+      <w:spacing w:before="280" w:after="80"/>
+      <w:outlineLvl w:val="3"/>
     </w:pPr>
     <w:rPr>
       <w:color w:val="666666"/>
@@ -1258,69 +1804,110 @@
       <w:szCs w:val="24"/>
     </w:rPr>
   </w:style>
-  <w:style w:type="paragraph" w:styleId="Heading5">
+  <w:style w:type="paragraph" w:styleId="Ttulo5">
     <w:name w:val="heading 5"/>
     <w:basedOn w:val="Normal"/>
     <w:next w:val="Normal"/>
+    <w:uiPriority w:val="9"/>
+    <w:semiHidden/>
+    <w:unhideWhenUsed/>
+    <w:qFormat/>
     <w:pPr>
-      <w:keepNext w:val="1"/>
-      <w:keepLines w:val="1"/>
-      <w:pageBreakBefore w:val="0"/>
-      <w:spacing w:after="80" w:before="240" w:lineRule="auto"/>
+      <w:keepNext/>
+      <w:keepLines/>
+      <w:spacing w:before="240" w:after="80"/>
+      <w:outlineLvl w:val="4"/>
     </w:pPr>
     <w:rPr>
       <w:color w:val="666666"/>
-      <w:sz w:val="22"/>
-      <w:szCs w:val="22"/>
     </w:rPr>
   </w:style>
-  <w:style w:type="paragraph" w:styleId="Heading6">
+  <w:style w:type="paragraph" w:styleId="Ttulo6">
     <w:name w:val="heading 6"/>
     <w:basedOn w:val="Normal"/>
     <w:next w:val="Normal"/>
+    <w:uiPriority w:val="9"/>
+    <w:semiHidden/>
+    <w:unhideWhenUsed/>
+    <w:qFormat/>
     <w:pPr>
-      <w:keepNext w:val="1"/>
-      <w:keepLines w:val="1"/>
-      <w:pageBreakBefore w:val="0"/>
-      <w:spacing w:after="80" w:before="240" w:lineRule="auto"/>
+      <w:keepNext/>
+      <w:keepLines/>
+      <w:spacing w:before="240" w:after="80"/>
+      <w:outlineLvl w:val="5"/>
     </w:pPr>
     <w:rPr>
-      <w:i w:val="1"/>
-      <w:iCs w:val="1"/>
+      <w:i/>
+      <w:iCs/>
       <w:color w:val="666666"/>
-      <w:sz w:val="22"/>
-      <w:szCs w:val="22"/>
     </w:rPr>
   </w:style>
-  <w:style w:type="paragraph" w:styleId="Title">
+  <w:style w:type="character" w:default="1" w:styleId="Fontepargpadro">
+    <w:name w:val="Default Paragraph Font"/>
+    <w:uiPriority w:val="1"/>
+    <w:semiHidden/>
+    <w:unhideWhenUsed/>
+  </w:style>
+  <w:style w:type="table" w:default="1" w:styleId="Tabelanormal">
+    <w:name w:val="Normal Table"/>
+    <w:uiPriority w:val="99"/>
+    <w:semiHidden/>
+    <w:unhideWhenUsed/>
+    <w:tblPr>
+      <w:tblInd w:w="0" w:type="dxa"/>
+      <w:tblCellMar>
+        <w:top w:w="0" w:type="dxa"/>
+        <w:left w:w="108" w:type="dxa"/>
+        <w:bottom w:w="0" w:type="dxa"/>
+        <w:right w:w="108" w:type="dxa"/>
+      </w:tblCellMar>
+    </w:tblPr>
+  </w:style>
+  <w:style w:type="numbering" w:default="1" w:styleId="Semlista">
+    <w:name w:val="No List"/>
+    <w:uiPriority w:val="99"/>
+    <w:semiHidden/>
+    <w:unhideWhenUsed/>
+  </w:style>
+  <w:style w:type="table" w:customStyle="1" w:styleId="TableNormal">
+    <w:name w:val="TableNormal"/>
+    <w:tblPr>
+      <w:tblCellMar>
+        <w:top w:w="100" w:type="dxa"/>
+        <w:left w:w="100" w:type="dxa"/>
+        <w:bottom w:w="100" w:type="dxa"/>
+        <w:right w:w="100" w:type="dxa"/>
+      </w:tblCellMar>
+    </w:tblPr>
+  </w:style>
+  <w:style w:type="paragraph" w:styleId="Ttulo">
     <w:name w:val="Title"/>
     <w:basedOn w:val="Normal"/>
     <w:next w:val="Normal"/>
+    <w:uiPriority w:val="10"/>
+    <w:qFormat/>
     <w:pPr>
-      <w:keepNext w:val="1"/>
-      <w:keepLines w:val="1"/>
-      <w:pageBreakBefore w:val="0"/>
-      <w:spacing w:after="60" w:before="0" w:lineRule="auto"/>
+      <w:keepNext/>
+      <w:keepLines/>
+      <w:spacing w:after="60"/>
     </w:pPr>
     <w:rPr>
       <w:sz w:val="52"/>
       <w:szCs w:val="52"/>
     </w:rPr>
   </w:style>
-  <w:style w:type="paragraph" w:styleId="Subtitle">
+  <w:style w:type="paragraph" w:styleId="Subttulo">
     <w:name w:val="Subtitle"/>
     <w:basedOn w:val="Normal"/>
     <w:next w:val="Normal"/>
+    <w:uiPriority w:val="11"/>
+    <w:qFormat/>
     <w:pPr>
-      <w:keepNext w:val="1"/>
-      <w:keepLines w:val="1"/>
-      <w:pageBreakBefore w:val="0"/>
-      <w:spacing w:after="320" w:before="0" w:lineRule="auto"/>
+      <w:keepNext/>
+      <w:keepLines/>
+      <w:spacing w:after="320"/>
     </w:pPr>
     <w:rPr>
-      <w:rFonts w:ascii="Arial" w:cs="Arial" w:eastAsia="Arial" w:hAnsi="Arial"/>
-      <w:i w:val="0"/>
-      <w:iCs w:val="0"/>
       <w:color w:val="666666"/>
       <w:sz w:val="30"/>
       <w:szCs w:val="30"/>

</xml_diff>